<commit_message>
Atualização dos assets de imagem
</commit_message>
<xml_diff>
--- a/Documentos/Explica_Projeto.docx
+++ b/Documentos/Explica_Projeto.docx
@@ -17,7 +17,21 @@
     </w:p>
     <w:p>
       <w:r>
-        <w:t>Apenas entenda cada linha de código, sua lógica e regras de renderização de conteúdo. Não precisa sugerir nenhuma refatoração por enquanto.</w:t>
+        <w:t>Apenas entenda cada linha de código</w:t>
+      </w:r>
+      <w:r>
+        <w:t xml:space="preserve"> acessando os links </w:t>
+      </w:r>
+      <w:proofErr w:type="spellStart"/>
+      <w:r>
+        <w:t>raw</w:t>
+      </w:r>
+      <w:proofErr w:type="spellEnd"/>
+      <w:r>
+        <w:t xml:space="preserve"> abaixo</w:t>
+      </w:r>
+      <w:r>
+        <w:t>, sua lógica e regras de renderização de conteúdo. Não precisa sugerir nenhuma refatoração por enquanto.</w:t>
       </w:r>
     </w:p>
     <w:p>
@@ -1729,6 +1743,601 @@
           <w:t>https://raw.githubusercontent.com/AlexBrazil/Multimidia_Web/refs/heads/main/data.json</w:t>
         </w:r>
       </w:hyperlink>
+    </w:p>
+    <w:p>
+      <w:pPr>
+        <w:rPr>
+          <w:rStyle w:val="Hyperlink"/>
+          <w:u w:val="none"/>
+        </w:rPr>
+      </w:pPr>
+    </w:p>
+    <w:p>
+      <w:pPr>
+        <w:rPr>
+          <w:rStyle w:val="Hyperlink"/>
+          <w:u w:val="none"/>
+        </w:rPr>
+      </w:pPr>
+      <w:r>
+        <w:rPr>
+          <w:rStyle w:val="Hyperlink"/>
+          <w:u w:val="none"/>
+        </w:rPr>
+        <w:t>Agora segue os tipos de elementos dos slides que podem ser renderizados:</w:t>
+      </w:r>
+    </w:p>
+    <w:p>
+      <w:pPr>
+        <w:rPr>
+          <w:b/>
+          <w:bCs/>
+        </w:rPr>
+      </w:pPr>
+      <w:r>
+        <w:rPr>
+          <w:b/>
+          <w:bCs/>
+        </w:rPr>
+        <w:t xml:space="preserve">Tipo </w:t>
+      </w:r>
+      <w:proofErr w:type="spellStart"/>
+      <w:r>
+        <w:rPr>
+          <w:b/>
+          <w:bCs/>
+        </w:rPr>
+        <w:t>TextElement</w:t>
+      </w:r>
+      <w:proofErr w:type="spellEnd"/>
+      <w:r>
+        <w:rPr>
+          <w:b/>
+          <w:bCs/>
+        </w:rPr>
+        <w:t xml:space="preserve"> - </w:t>
+      </w:r>
+      <w:r>
+        <w:rPr>
+          <w:b/>
+          <w:bCs/>
+        </w:rPr>
+        <w:t>Um trecho de texto</w:t>
+      </w:r>
+      <w:r>
+        <w:rPr>
+          <w:b/>
+          <w:bCs/>
+        </w:rPr>
+        <w:t xml:space="preserve"> - </w:t>
+      </w:r>
+      <w:r>
+        <w:rPr>
+          <w:b/>
+          <w:bCs/>
+        </w:rPr>
+        <w:t>text-element.js</w:t>
+      </w:r>
+    </w:p>
+    <w:p>
+      <w:pPr>
+        <w:rPr>
+          <w:rStyle w:val="Hyperlink"/>
+          <w:u w:val="none"/>
+        </w:rPr>
+      </w:pPr>
+      <w:hyperlink r:id="rId9" w:history="1">
+        <w:r>
+          <w:rPr>
+            <w:rStyle w:val="Hyperlink"/>
+          </w:rPr>
+          <w:t>https://raw.githubusercontent.com/AlexBrazil/Multimidia_Web/refs/heads/main/js/elements/text-element.js</w:t>
+        </w:r>
+      </w:hyperlink>
+    </w:p>
+    <w:p>
+      <w:pPr>
+        <w:rPr>
+          <w:rStyle w:val="Hyperlink"/>
+          <w:u w:val="none"/>
+        </w:rPr>
+      </w:pPr>
+    </w:p>
+    <w:p>
+      <w:pPr>
+        <w:rPr>
+          <w:b/>
+          <w:bCs/>
+        </w:rPr>
+      </w:pPr>
+      <w:proofErr w:type="spellStart"/>
+      <w:r>
+        <w:rPr>
+          <w:b/>
+          <w:bCs/>
+        </w:rPr>
+        <w:t>ListElement</w:t>
+      </w:r>
+      <w:proofErr w:type="spellEnd"/>
+      <w:r>
+        <w:rPr>
+          <w:b/>
+          <w:bCs/>
+        </w:rPr>
+        <w:t>: Uma lista com marcadores ou numerada</w:t>
+      </w:r>
+      <w:r>
+        <w:rPr>
+          <w:b/>
+          <w:bCs/>
+        </w:rPr>
+        <w:t xml:space="preserve"> - </w:t>
+      </w:r>
+      <w:r>
+        <w:rPr>
+          <w:b/>
+          <w:bCs/>
+        </w:rPr>
+        <w:t>list-element.js</w:t>
+      </w:r>
+    </w:p>
+    <w:p>
+      <w:pPr>
+        <w:rPr>
+          <w:rStyle w:val="Hyperlink"/>
+          <w:u w:val="none"/>
+        </w:rPr>
+      </w:pPr>
+      <w:hyperlink r:id="rId10" w:history="1">
+        <w:r>
+          <w:rPr>
+            <w:rStyle w:val="Hyperlink"/>
+          </w:rPr>
+          <w:t>https://raw.githubusercontent.com/AlexBrazil/Multimidia_Web/refs/heads/main/js/elements/list-element.js</w:t>
+        </w:r>
+      </w:hyperlink>
+    </w:p>
+    <w:p>
+      <w:pPr>
+        <w:rPr>
+          <w:rStyle w:val="Hyperlink"/>
+          <w:u w:val="none"/>
+        </w:rPr>
+      </w:pPr>
+    </w:p>
+    <w:p>
+      <w:pPr>
+        <w:rPr>
+          <w:b/>
+          <w:bCs/>
+        </w:rPr>
+      </w:pPr>
+      <w:proofErr w:type="spellStart"/>
+      <w:r>
+        <w:rPr>
+          <w:b/>
+          <w:bCs/>
+        </w:rPr>
+        <w:t>VideoElement</w:t>
+      </w:r>
+      <w:proofErr w:type="spellEnd"/>
+      <w:r>
+        <w:rPr>
+          <w:b/>
+          <w:bCs/>
+        </w:rPr>
+        <w:t xml:space="preserve">: </w:t>
+      </w:r>
+      <w:r>
+        <w:rPr>
+          <w:b/>
+          <w:bCs/>
+        </w:rPr>
+        <w:t>Sistema avançado de reprodução de vídeo com suporte a</w:t>
+      </w:r>
+      <w:r>
+        <w:rPr>
+          <w:b/>
+          <w:bCs/>
+        </w:rPr>
+        <w:t xml:space="preserve"> </w:t>
+      </w:r>
+      <w:proofErr w:type="spellStart"/>
+      <w:r>
+        <w:rPr>
+          <w:b/>
+          <w:bCs/>
+        </w:rPr>
+        <w:t>youtube</w:t>
+      </w:r>
+      <w:proofErr w:type="spellEnd"/>
+      <w:r>
+        <w:rPr>
+          <w:b/>
+          <w:bCs/>
+        </w:rPr>
+        <w:t xml:space="preserve">, mídia direta e </w:t>
+      </w:r>
+      <w:proofErr w:type="spellStart"/>
+      <w:r>
+        <w:rPr>
+          <w:b/>
+          <w:bCs/>
+        </w:rPr>
+        <w:t>Fallback</w:t>
+      </w:r>
+      <w:proofErr w:type="spellEnd"/>
+      <w:r>
+        <w:rPr>
+          <w:b/>
+          <w:bCs/>
+        </w:rPr>
+        <w:t xml:space="preserve"> para links externos</w:t>
+      </w:r>
+      <w:r>
+        <w:rPr>
+          <w:b/>
+          <w:bCs/>
+        </w:rPr>
+        <w:t xml:space="preserve"> - </w:t>
+      </w:r>
+      <w:r>
+        <w:rPr>
+          <w:b/>
+          <w:bCs/>
+        </w:rPr>
+        <w:t>video-element.js</w:t>
+      </w:r>
+    </w:p>
+    <w:p>
+      <w:hyperlink r:id="rId11" w:history="1">
+        <w:r>
+          <w:rPr>
+            <w:rStyle w:val="Hyperlink"/>
+          </w:rPr>
+          <w:t>https://raw.githubusercontent.com/AlexBrazil/Multimidia_Web/refs/heads/main/js/elements/video-element.js</w:t>
+        </w:r>
+      </w:hyperlink>
+    </w:p>
+    <w:p>
+      <w:pPr>
+        <w:rPr>
+          <w:b/>
+          <w:bCs/>
+        </w:rPr>
+      </w:pPr>
+    </w:p>
+    <w:p>
+      <w:pPr>
+        <w:rPr>
+          <w:b/>
+          <w:bCs/>
+        </w:rPr>
+      </w:pPr>
+      <w:proofErr w:type="spellStart"/>
+      <w:r>
+        <w:rPr>
+          <w:b/>
+          <w:bCs/>
+        </w:rPr>
+        <w:t>SpacerElement</w:t>
+      </w:r>
+      <w:proofErr w:type="spellEnd"/>
+      <w:r>
+        <w:rPr>
+          <w:b/>
+          <w:bCs/>
+        </w:rPr>
+        <w:t>: Usado para layout, para criar um espaço vazio</w:t>
+      </w:r>
+      <w:r>
+        <w:rPr>
+          <w:b/>
+          <w:bCs/>
+        </w:rPr>
+        <w:t xml:space="preserve"> - </w:t>
+      </w:r>
+      <w:r>
+        <w:rPr>
+          <w:b/>
+          <w:bCs/>
+        </w:rPr>
+        <w:t>spacer-element.js</w:t>
+      </w:r>
+    </w:p>
+    <w:p>
+      <w:hyperlink r:id="rId12" w:history="1">
+        <w:r>
+          <w:rPr>
+            <w:rStyle w:val="Hyperlink"/>
+          </w:rPr>
+          <w:t>https://raw.githubusercontent.com/AlexBrazil/Multimidia_Web/refs/heads/main/js/elements/spacer-element.js</w:t>
+        </w:r>
+      </w:hyperlink>
+    </w:p>
+    <w:p>
+      <w:pPr>
+        <w:rPr>
+          <w:b/>
+          <w:bCs/>
+        </w:rPr>
+      </w:pPr>
+    </w:p>
+    <w:p>
+      <w:pPr>
+        <w:rPr>
+          <w:b/>
+          <w:bCs/>
+        </w:rPr>
+      </w:pPr>
+      <w:proofErr w:type="spellStart"/>
+      <w:r>
+        <w:rPr>
+          <w:b/>
+          <w:bCs/>
+        </w:rPr>
+        <w:t>GridElement</w:t>
+      </w:r>
+      <w:proofErr w:type="spellEnd"/>
+      <w:r>
+        <w:rPr>
+          <w:b/>
+          <w:bCs/>
+        </w:rPr>
+        <w:t>: Uma grade ou tabela</w:t>
+      </w:r>
+      <w:r>
+        <w:rPr>
+          <w:b/>
+          <w:bCs/>
+        </w:rPr>
+        <w:t xml:space="preserve"> - </w:t>
+      </w:r>
+      <w:r>
+        <w:rPr>
+          <w:b/>
+          <w:bCs/>
+        </w:rPr>
+        <w:t>grid-element.js</w:t>
+      </w:r>
+    </w:p>
+    <w:p>
+      <w:pPr>
+        <w:rPr>
+          <w:b/>
+          <w:bCs/>
+        </w:rPr>
+      </w:pPr>
+      <w:hyperlink r:id="rId13" w:history="1">
+        <w:r>
+          <w:rPr>
+            <w:rStyle w:val="Hyperlink"/>
+            <w:b/>
+            <w:bCs/>
+          </w:rPr>
+          <w:t>https://raw.githubusercontent.com/AlexBrazil/Multimidia_Web/refs/heads/main/js/elements/grid-element.js</w:t>
+        </w:r>
+      </w:hyperlink>
+    </w:p>
+    <w:p>
+      <w:pPr>
+        <w:rPr>
+          <w:b/>
+          <w:bCs/>
+        </w:rPr>
+      </w:pPr>
+    </w:p>
+    <w:p>
+      <w:pPr>
+        <w:rPr>
+          <w:b/>
+          <w:bCs/>
+        </w:rPr>
+      </w:pPr>
+      <w:proofErr w:type="spellStart"/>
+      <w:r>
+        <w:rPr>
+          <w:b/>
+          <w:bCs/>
+        </w:rPr>
+        <w:t>GroupElement</w:t>
+      </w:r>
+      <w:proofErr w:type="spellEnd"/>
+      <w:r>
+        <w:rPr>
+          <w:b/>
+          <w:bCs/>
+        </w:rPr>
+        <w:t>: Um contêiner para agrupar outros elementos para fins de layout</w:t>
+      </w:r>
+      <w:r>
+        <w:rPr>
+          <w:b/>
+          <w:bCs/>
+        </w:rPr>
+        <w:t xml:space="preserve"> - </w:t>
+      </w:r>
+      <w:r>
+        <w:rPr>
+          <w:b/>
+          <w:bCs/>
+        </w:rPr>
+        <w:t>group-element.js</w:t>
+      </w:r>
+    </w:p>
+    <w:p>
+      <w:pPr>
+        <w:rPr>
+          <w:b/>
+          <w:bCs/>
+        </w:rPr>
+      </w:pPr>
+      <w:hyperlink r:id="rId14" w:history="1">
+        <w:r>
+          <w:rPr>
+            <w:rStyle w:val="Hyperlink"/>
+            <w:b/>
+            <w:bCs/>
+          </w:rPr>
+          <w:t>https://raw.githubusercontent.com/AlexBrazil/Multimidia_Web/refs/heads/main/js/elements/group-element.js</w:t>
+        </w:r>
+      </w:hyperlink>
+    </w:p>
+    <w:p>
+      <w:pPr>
+        <w:rPr>
+          <w:b/>
+          <w:bCs/>
+        </w:rPr>
+      </w:pPr>
+      <w:proofErr w:type="spellStart"/>
+      <w:r>
+        <w:rPr>
+          <w:b/>
+          <w:bCs/>
+        </w:rPr>
+        <w:lastRenderedPageBreak/>
+        <w:t>InfoBoxElement</w:t>
+      </w:r>
+      <w:proofErr w:type="spellEnd"/>
+      <w:r>
+        <w:rPr>
+          <w:b/>
+          <w:bCs/>
+        </w:rPr>
+        <w:t>: Um tipo especial de </w:t>
+      </w:r>
+      <w:proofErr w:type="spellStart"/>
+      <w:r>
+        <w:rPr>
+          <w:b/>
+          <w:bCs/>
+        </w:rPr>
+        <w:t>GroupElement</w:t>
+      </w:r>
+      <w:proofErr w:type="spellEnd"/>
+      <w:r>
+        <w:rPr>
+          <w:b/>
+          <w:bCs/>
+        </w:rPr>
+        <w:t> que aparece como uma caixa de destaque estilizada</w:t>
+      </w:r>
+      <w:r>
+        <w:rPr>
+          <w:b/>
+          <w:bCs/>
+        </w:rPr>
+        <w:t>. Possui seu gatilho, que é um botão que abrirá uma modal.</w:t>
+      </w:r>
+    </w:p>
+    <w:p>
+      <w:hyperlink r:id="rId15" w:history="1">
+        <w:r>
+          <w:rPr>
+            <w:rStyle w:val="Hyperlink"/>
+          </w:rPr>
+          <w:t>https://raw.githubusercontent.com/AlexBrazil/Multimidia_Web/refs/heads/main/js/elements/infobox-element.js</w:t>
+        </w:r>
+      </w:hyperlink>
+    </w:p>
+    <w:p>
+      <w:pPr>
+        <w:rPr>
+          <w:b/>
+          <w:bCs/>
+          <w:u w:val="single"/>
+        </w:rPr>
+      </w:pPr>
+    </w:p>
+    <w:p>
+      <w:proofErr w:type="spellStart"/>
+      <w:r>
+        <w:t>ImageElement</w:t>
+      </w:r>
+      <w:proofErr w:type="spellEnd"/>
+      <w:r>
+        <w:t xml:space="preserve">: Renderização de imagens com suporte a legenda e </w:t>
+      </w:r>
+      <w:proofErr w:type="spellStart"/>
+      <w:r>
+        <w:t>fallback</w:t>
+      </w:r>
+      <w:proofErr w:type="spellEnd"/>
+      <w:r>
+        <w:t xml:space="preserve"> Flash - image-element.js </w:t>
+      </w:r>
+    </w:p>
+    <w:p>
+      <w:pPr>
+        <w:rPr>
+          <w:b/>
+          <w:bCs/>
+          <w:u w:val="single"/>
+        </w:rPr>
+      </w:pPr>
+      <w:hyperlink r:id="rId16" w:history="1">
+        <w:r>
+          <w:rPr>
+            <w:rStyle w:val="Hyperlink"/>
+            <w:b/>
+            <w:bCs/>
+          </w:rPr>
+          <w:t>https://raw.githubusercontent.com/AlexBrazil/Multimidia_Web/refs/heads/main/js/elements/image-element.js</w:t>
+        </w:r>
+      </w:hyperlink>
+    </w:p>
+    <w:p>
+      <w:r>
+        <w:t xml:space="preserve"> </w:t>
+      </w:r>
+    </w:p>
+    <w:p>
+      <w:proofErr w:type="spellStart"/>
+      <w:r>
+        <w:t>AppLauncherElement</w:t>
+      </w:r>
+      <w:proofErr w:type="spellEnd"/>
+      <w:r>
+        <w:t xml:space="preserve">: Lançador de aplicativos/jogos externos (ZIP ou </w:t>
+      </w:r>
+      <w:proofErr w:type="spellStart"/>
+      <w:r>
+        <w:t>WebGL</w:t>
+      </w:r>
+      <w:proofErr w:type="spellEnd"/>
+      <w:r>
+        <w:t xml:space="preserve">) - app-launcher.js </w:t>
+      </w:r>
+      <w:hyperlink r:id="rId17" w:history="1">
+        <w:r>
+          <w:rPr>
+            <w:rStyle w:val="Hyperlink"/>
+            <w:b/>
+            <w:bCs/>
+          </w:rPr>
+          <w:t>https://raw.githubusercontent.com/AlexBrazil/Multimidia_Web/refs/heads/main/js/elements/app-launcher.js</w:t>
+        </w:r>
+      </w:hyperlink>
+    </w:p>
+    <w:p/>
+    <w:p>
+      <w:pPr>
+        <w:rPr>
+          <w:b/>
+          <w:bCs/>
+          <w:u w:val="single"/>
+        </w:rPr>
+      </w:pPr>
+    </w:p>
+    <w:p>
+      <w:pPr>
+        <w:rPr>
+          <w:b/>
+          <w:bCs/>
+          <w:u w:val="single"/>
+        </w:rPr>
+      </w:pPr>
     </w:p>
     <w:p>
       <w:pPr>
@@ -2703,6 +3312,36 @@
       <w:shd w:val="clear" w:color="auto" w:fill="E1DFDD"/>
     </w:rPr>
   </w:style>
+  <w:style w:type="paragraph" w:styleId="Pr-formataoHTML">
+    <w:name w:val="HTML Preformatted"/>
+    <w:basedOn w:val="Normal"/>
+    <w:link w:val="Pr-formataoHTMLChar"/>
+    <w:uiPriority w:val="99"/>
+    <w:semiHidden/>
+    <w:unhideWhenUsed/>
+    <w:rsid w:val="00A82CB1"/>
+    <w:pPr>
+      <w:spacing w:after="0" w:line="240" w:lineRule="auto"/>
+    </w:pPr>
+    <w:rPr>
+      <w:rFonts w:ascii="Consolas" w:hAnsi="Consolas"/>
+      <w:sz w:val="20"/>
+      <w:szCs w:val="20"/>
+    </w:rPr>
+  </w:style>
+  <w:style w:type="character" w:customStyle="1" w:styleId="Pr-formataoHTMLChar">
+    <w:name w:val="Pré-formatação HTML Char"/>
+    <w:basedOn w:val="Fontepargpadro"/>
+    <w:link w:val="Pr-formataoHTML"/>
+    <w:uiPriority w:val="99"/>
+    <w:semiHidden/>
+    <w:rsid w:val="00A82CB1"/>
+    <w:rPr>
+      <w:rFonts w:ascii="Consolas" w:hAnsi="Consolas"/>
+      <w:sz w:val="20"/>
+      <w:szCs w:val="20"/>
+    </w:rPr>
+  </w:style>
 </w:styles>
 </file>
 

</xml_diff>

<commit_message>
refatorado btn scroll indicator
</commit_message>
<xml_diff>
--- a/Documentos/Explica_Projeto.docx
+++ b/Documentos/Explica_Projeto.docx
@@ -454,11 +454,24 @@
       </w:r>
       <w:proofErr w:type="spellEnd"/>
       <w:r>
+        <w:t>": "TextElement",</w:t>
+      </w:r>
+    </w:p>
+    <w:p>
+      <w:r>
+        <w:t>                      "</w:t>
+      </w:r>
+      <w:proofErr w:type="spellStart"/>
+      <w:r>
+        <w:t>styleName</w:t>
+      </w:r>
+      <w:proofErr w:type="spellEnd"/>
+      <w:r>
         <w:t>": "</w:t>
       </w:r>
       <w:proofErr w:type="spellStart"/>
       <w:r>
-        <w:t>TextElement</w:t>
+        <w:t>paragraph</w:t>
       </w:r>
       <w:proofErr w:type="spellEnd"/>
       <w:r>
@@ -471,19 +484,29 @@
       </w:r>
       <w:proofErr w:type="spellStart"/>
       <w:r>
-        <w:t>styleName</w:t>
-      </w:r>
-      <w:proofErr w:type="spellEnd"/>
-      <w:r>
-        <w:t>": "</w:t>
-      </w:r>
-      <w:proofErr w:type="spellStart"/>
-      <w:r>
-        <w:t>paragraph</w:t>
-      </w:r>
-      <w:proofErr w:type="spellEnd"/>
-      <w:r>
-        <w:t>",</w:t>
+        <w:t>text</w:t>
+      </w:r>
+      <w:proofErr w:type="spellEnd"/>
+      <w:r>
+        <w:t xml:space="preserve">": "Exemplo de texto dentro de um </w:t>
+      </w:r>
+      <w:proofErr w:type="spellStart"/>
+      <w:r>
+        <w:t>GroupElement</w:t>
+      </w:r>
+      <w:proofErr w:type="spellEnd"/>
+      <w:r>
+        <w:t>."</w:t>
+      </w:r>
+    </w:p>
+    <w:p>
+      <w:r>
+        <w:t>                    },</w:t>
+      </w:r>
+    </w:p>
+    <w:p>
+      <w:r>
+        <w:t>                    {</w:t>
       </w:r>
     </w:p>
     <w:p>
@@ -492,50 +515,11 @@
       </w:r>
       <w:proofErr w:type="spellStart"/>
       <w:r>
-        <w:t>text</w:t>
-      </w:r>
-      <w:proofErr w:type="spellEnd"/>
-      <w:r>
-        <w:t xml:space="preserve">": "Exemplo de texto dentro de um </w:t>
-      </w:r>
-      <w:proofErr w:type="spellStart"/>
-      <w:r>
-        <w:t>GroupElement</w:t>
-      </w:r>
-      <w:proofErr w:type="spellEnd"/>
-      <w:r>
-        <w:t>."</w:t>
-      </w:r>
-    </w:p>
-    <w:p>
-      <w:r>
-        <w:t>                    },</w:t>
-      </w:r>
-    </w:p>
-    <w:p>
-      <w:r>
-        <w:t>                    {</w:t>
-      </w:r>
-    </w:p>
-    <w:p>
-      <w:r>
-        <w:t>                      "</w:t>
-      </w:r>
-      <w:proofErr w:type="spellStart"/>
-      <w:r>
         <w:t>type</w:t>
       </w:r>
       <w:proofErr w:type="spellEnd"/>
       <w:r>
-        <w:t>": "</w:t>
-      </w:r>
-      <w:proofErr w:type="spellStart"/>
-      <w:r>
-        <w:t>ImageElement</w:t>
-      </w:r>
-      <w:proofErr w:type="spellEnd"/>
-      <w:r>
-        <w:t>",</w:t>
+        <w:t>": "ImageElement",</w:t>
       </w:r>
     </w:p>
     <w:p>
@@ -1028,15 +1012,7 @@
       </w:r>
       <w:proofErr w:type="spellEnd"/>
       <w:r>
-        <w:t>": "</w:t>
-      </w:r>
-      <w:proofErr w:type="spellStart"/>
-      <w:r>
-        <w:t>TextElement</w:t>
-      </w:r>
-      <w:proofErr w:type="spellEnd"/>
-      <w:r>
-        <w:t>",</w:t>
+        <w:t>": "TextElement",</w:t>
       </w:r>
     </w:p>
     <w:p>
@@ -1327,13 +1303,8 @@
       </w:r>
       <w:proofErr w:type="spellEnd"/>
       <w:r>
-        <w:t xml:space="preserve">": </w:t>
-      </w:r>
-      <w:proofErr w:type="spellStart"/>
-      <w:r>
-        <w:t>true</w:t>
-      </w:r>
-      <w:proofErr w:type="spellEnd"/>
+        <w:t>": true</w:t>
+      </w:r>
     </w:p>
     <w:p>
       <w:r>
@@ -2322,6 +2293,23 @@
     </w:p>
     <w:p/>
     <w:p>
+      <w:r>
+        <w:t>base.js</w:t>
+      </w:r>
+      <w:r>
+        <w:t xml:space="preserve">: </w:t>
+      </w:r>
+      <w:r>
+        <w:t>Utilitários compartilhados entre todos os elementos do slide.</w:t>
+      </w:r>
+      <w:r>
+        <w:t xml:space="preserve"> </w:t>
+      </w:r>
+      <w:r>
+        <w:t>Centraliza funcionalidades comuns para evitar duplicação</w:t>
+      </w:r>
+    </w:p>
+    <w:p>
       <w:pPr>
         <w:rPr>
           <w:b/>
@@ -2329,6 +2317,16 @@
           <w:u w:val="single"/>
         </w:rPr>
       </w:pPr>
+      <w:hyperlink r:id="rId18" w:history="1">
+        <w:r>
+          <w:rPr>
+            <w:rStyle w:val="Hyperlink"/>
+            <w:b/>
+            <w:bCs/>
+          </w:rPr>
+          <w:t>https://raw.githubusercontent.com/AlexBrazil/Multimidia_Web/refs/heads/main/js/elements/base.js</w:t>
+        </w:r>
+      </w:hyperlink>
     </w:p>
     <w:p>
       <w:pPr>
@@ -2961,7 +2959,6 @@
   <w:style w:type="character" w:default="1" w:styleId="Fontepargpadro">
     <w:name w:val="Default Paragraph Font"/>
     <w:uiPriority w:val="1"/>
-    <w:semiHidden/>
     <w:unhideWhenUsed/>
   </w:style>
   <w:style w:type="table" w:default="1" w:styleId="Tabelanormal">

</xml_diff>

<commit_message>
Refatorado infobox para ter modo flow-end
</commit_message>
<xml_diff>
--- a/Documentos/Explica_Projeto.docx
+++ b/Documentos/Explica_Projeto.docx
@@ -2294,29 +2294,10 @@
     <w:p/>
     <w:p>
       <w:r>
-        <w:t>base.js</w:t>
-      </w:r>
-      <w:r>
-        <w:t xml:space="preserve">: </w:t>
-      </w:r>
-      <w:r>
-        <w:t>Utilitários compartilhados entre todos os elementos do slide.</w:t>
-      </w:r>
-      <w:r>
-        <w:t xml:space="preserve"> </w:t>
-      </w:r>
-      <w:r>
-        <w:t>Centraliza funcionalidades comuns para evitar duplicação</w:t>
-      </w:r>
-    </w:p>
-    <w:p>
-      <w:pPr>
-        <w:rPr>
-          <w:b/>
-          <w:bCs/>
-          <w:u w:val="single"/>
-        </w:rPr>
-      </w:pPr>
+        <w:t>base.js: Utilitários compartilhados entre todos os elementos do slide. Centraliza funcionalidades comuns para evitar duplicação</w:t>
+      </w:r>
+    </w:p>
+    <w:p>
       <w:hyperlink r:id="rId18" w:history="1">
         <w:r>
           <w:rPr>
@@ -2327,6 +2308,26 @@
           <w:t>https://raw.githubusercontent.com/AlexBrazil/Multimidia_Web/refs/heads/main/js/elements/base.js</w:t>
         </w:r>
       </w:hyperlink>
+    </w:p>
+    <w:p>
+      <w:pPr>
+        <w:rPr>
+          <w:b/>
+          <w:bCs/>
+          <w:u w:val="single"/>
+        </w:rPr>
+      </w:pPr>
+      <w:r>
+        <w:t xml:space="preserve">Acesse casa link </w:t>
+      </w:r>
+      <w:proofErr w:type="spellStart"/>
+      <w:r>
+        <w:t>raw</w:t>
+      </w:r>
+      <w:proofErr w:type="spellEnd"/>
+      <w:r>
+        <w:t xml:space="preserve"> para entender de forma completa como os slides são renderizados e como ocorre a navegação pelos mesmos.</w:t>
+      </w:r>
     </w:p>
     <w:p>
       <w:pPr>
@@ -2959,6 +2960,7 @@
   <w:style w:type="character" w:default="1" w:styleId="Fontepargpadro">
     <w:name w:val="Default Paragraph Font"/>
     <w:uiPriority w:val="1"/>
+    <w:semiHidden/>
     <w:unhideWhenUsed/>
   </w:style>
   <w:style w:type="table" w:default="1" w:styleId="Tabelanormal">

</xml_diff>

<commit_message>
CSS refatorado e arquivo style.css divivido por resposnabilidades
</commit_message>
<xml_diff>
--- a/Documentos/Explica_Projeto.docx
+++ b/Documentos/Explica_Projeto.docx
@@ -4,15 +4,7 @@
   <w:body>
     <w:p>
       <w:r>
-        <w:t xml:space="preserve">Vou lhe explicar um projeto de uma aplicação Web que usa como base dos dados um </w:t>
-      </w:r>
-      <w:proofErr w:type="spellStart"/>
-      <w:r>
-        <w:t>json</w:t>
-      </w:r>
-      <w:proofErr w:type="spellEnd"/>
-      <w:r>
-        <w:t>.</w:t>
+        <w:t>Vou lhe explicar um projeto de uma aplicação Web que usa como base dos dados um json.</w:t>
       </w:r>
     </w:p>
     <w:p>
@@ -20,15 +12,7 @@
         <w:t>Apenas entenda cada linha de código</w:t>
       </w:r>
       <w:r>
-        <w:t xml:space="preserve"> acessando os links </w:t>
-      </w:r>
-      <w:proofErr w:type="spellStart"/>
-      <w:r>
-        <w:t>raw</w:t>
-      </w:r>
-      <w:proofErr w:type="spellEnd"/>
-      <w:r>
-        <w:t xml:space="preserve"> abaixo</w:t>
+        <w:t xml:space="preserve"> acessando os links raw abaixo</w:t>
       </w:r>
       <w:r>
         <w:t>, sua lógica e regras de renderização de conteúdo. Não precisa sugerir nenhuma refatoração por enquanto.</w:t>
@@ -38,7 +22,6 @@
       <w:r>
         <w:t xml:space="preserve">Este </w:t>
       </w:r>
-      <w:proofErr w:type="spellStart"/>
       <w:r>
         <w:rPr>
           <w:b/>
@@ -49,7 +32,6 @@
         </w:rPr>
         <w:t>json</w:t>
       </w:r>
-      <w:proofErr w:type="spellEnd"/>
       <w:r>
         <w:rPr>
           <w:color w:val="EE0000"/>
@@ -69,23 +51,7 @@
     </w:p>
     <w:p>
       <w:r>
-        <w:t>  "</w:t>
-      </w:r>
-      <w:proofErr w:type="spellStart"/>
-      <w:r>
-        <w:t>type</w:t>
-      </w:r>
-      <w:proofErr w:type="spellEnd"/>
-      <w:r>
-        <w:t>": "</w:t>
-      </w:r>
-      <w:proofErr w:type="spellStart"/>
-      <w:r>
-        <w:t>SlideGroup</w:t>
-      </w:r>
-      <w:proofErr w:type="spellEnd"/>
-      <w:r>
-        <w:t>",</w:t>
+        <w:t>  "type": "SlideGroup",</w:t>
       </w:r>
     </w:p>
     <w:p>
@@ -95,41 +61,17 @@
     </w:p>
     <w:p>
       <w:r>
-        <w:t>  "</w:t>
-      </w:r>
-      <w:proofErr w:type="spellStart"/>
-      <w:r>
-        <w:t>title</w:t>
-      </w:r>
-      <w:proofErr w:type="spellEnd"/>
-      <w:r>
-        <w:t>": "Nosso Trânsito Multimídia",</w:t>
-      </w:r>
-    </w:p>
-    <w:p>
-      <w:r>
-        <w:t>  "</w:t>
-      </w:r>
-      <w:proofErr w:type="spellStart"/>
-      <w:r>
-        <w:t>productId</w:t>
-      </w:r>
-      <w:proofErr w:type="spellEnd"/>
-      <w:r>
-        <w:t>": "000001",</w:t>
-      </w:r>
-    </w:p>
-    <w:p>
-      <w:r>
-        <w:t>  "</w:t>
-      </w:r>
-      <w:proofErr w:type="spellStart"/>
-      <w:r>
-        <w:t>items</w:t>
-      </w:r>
-      <w:proofErr w:type="spellEnd"/>
-      <w:r>
-        <w:t>": [</w:t>
+        <w:t>  "title": "Nosso Trânsito Multimídia",</w:t>
+      </w:r>
+    </w:p>
+    <w:p>
+      <w:r>
+        <w:t>  "productId": "000001",</w:t>
+      </w:r>
+    </w:p>
+    <w:p>
+      <w:r>
+        <w:t>  "items": [</w:t>
       </w:r>
     </w:p>
     <w:p>
@@ -139,23 +81,7 @@
     </w:p>
     <w:p>
       <w:r>
-        <w:t>      "</w:t>
-      </w:r>
-      <w:proofErr w:type="spellStart"/>
-      <w:r>
-        <w:t>type</w:t>
-      </w:r>
-      <w:proofErr w:type="spellEnd"/>
-      <w:r>
-        <w:t>": "</w:t>
-      </w:r>
-      <w:proofErr w:type="spellStart"/>
-      <w:r>
-        <w:t>SlideGroup</w:t>
-      </w:r>
-      <w:proofErr w:type="spellEnd"/>
-      <w:r>
-        <w:t>",</w:t>
+        <w:t>      "type": "SlideGroup",</w:t>
       </w:r>
     </w:p>
     <w:p>
@@ -165,28 +91,12 @@
     </w:p>
     <w:p>
       <w:r>
-        <w:t>      "</w:t>
-      </w:r>
-      <w:proofErr w:type="spellStart"/>
-      <w:r>
-        <w:t>title</w:t>
-      </w:r>
-      <w:proofErr w:type="spellEnd"/>
-      <w:r>
-        <w:t>": "Legislação de Trânsito",</w:t>
-      </w:r>
-    </w:p>
-    <w:p>
-      <w:r>
-        <w:t>      "</w:t>
-      </w:r>
-      <w:proofErr w:type="spellStart"/>
-      <w:r>
-        <w:t>items</w:t>
-      </w:r>
-      <w:proofErr w:type="spellEnd"/>
-      <w:r>
-        <w:t>": [</w:t>
+        <w:t>      "title": "Legislação de Trânsito",</w:t>
+      </w:r>
+    </w:p>
+    <w:p>
+      <w:r>
+        <w:t>      "items": [</w:t>
       </w:r>
     </w:p>
     <w:p>
@@ -196,23 +106,7 @@
     </w:p>
     <w:p>
       <w:r>
-        <w:t>          "</w:t>
-      </w:r>
-      <w:proofErr w:type="spellStart"/>
-      <w:r>
-        <w:t>type</w:t>
-      </w:r>
-      <w:proofErr w:type="spellEnd"/>
-      <w:r>
-        <w:t>": "</w:t>
-      </w:r>
-      <w:proofErr w:type="spellStart"/>
-      <w:r>
-        <w:t>SlideGroup</w:t>
-      </w:r>
-      <w:proofErr w:type="spellEnd"/>
-      <w:r>
-        <w:t>",</w:t>
+        <w:t>          "type": "SlideGroup",</w:t>
       </w:r>
     </w:p>
     <w:p>
@@ -222,28 +116,12 @@
     </w:p>
     <w:p>
       <w:r>
-        <w:t>          "</w:t>
-      </w:r>
-      <w:proofErr w:type="spellStart"/>
-      <w:r>
-        <w:t>title</w:t>
-      </w:r>
-      <w:proofErr w:type="spellEnd"/>
-      <w:r>
-        <w:t>": "Formação do Condutor",</w:t>
-      </w:r>
-    </w:p>
-    <w:p>
-      <w:r>
-        <w:t>          "</w:t>
-      </w:r>
-      <w:proofErr w:type="spellStart"/>
-      <w:r>
-        <w:t>items</w:t>
-      </w:r>
-      <w:proofErr w:type="spellEnd"/>
-      <w:r>
-        <w:t>": [</w:t>
+        <w:t>          "title": "Formação do Condutor",</w:t>
+      </w:r>
+    </w:p>
+    <w:p>
+      <w:r>
+        <w:t>          "items": [</w:t>
       </w:r>
     </w:p>
     <w:p>
@@ -253,15 +131,7 @@
     </w:p>
     <w:p>
       <w:r>
-        <w:t>              "</w:t>
-      </w:r>
-      <w:proofErr w:type="spellStart"/>
-      <w:r>
-        <w:t>type</w:t>
-      </w:r>
-      <w:proofErr w:type="spellEnd"/>
-      <w:r>
-        <w:t>": "Slide",</w:t>
+        <w:t>              "type": "Slide",</w:t>
       </w:r>
     </w:p>
     <w:p>
@@ -271,76 +141,28 @@
     </w:p>
     <w:p>
       <w:r>
-        <w:t>              "</w:t>
-      </w:r>
-      <w:proofErr w:type="spellStart"/>
-      <w:r>
-        <w:t>bookReference</w:t>
-      </w:r>
-      <w:proofErr w:type="spellEnd"/>
-      <w:r>
-        <w:t>": "4",</w:t>
-      </w:r>
-    </w:p>
-    <w:p>
-      <w:r>
-        <w:t>              "</w:t>
-      </w:r>
-      <w:proofErr w:type="spellStart"/>
-      <w:r>
-        <w:t>title</w:t>
-      </w:r>
-      <w:proofErr w:type="spellEnd"/>
-      <w:r>
-        <w:t>": "Pré-requisitos Para Habilitação",</w:t>
-      </w:r>
-    </w:p>
-    <w:p>
-      <w:r>
-        <w:t>              "</w:t>
-      </w:r>
-      <w:proofErr w:type="spellStart"/>
-      <w:r>
-        <w:t>subtitle</w:t>
-      </w:r>
-      <w:proofErr w:type="spellEnd"/>
-      <w:r>
-        <w:t xml:space="preserve">": </w:t>
-      </w:r>
-      <w:proofErr w:type="spellStart"/>
-      <w:r>
-        <w:t>null</w:t>
-      </w:r>
-      <w:proofErr w:type="spellEnd"/>
-      <w:r>
-        <w:t>,</w:t>
+        <w:t>              "bookReference": "4",</w:t>
+      </w:r>
+    </w:p>
+    <w:p>
+      <w:r>
+        <w:t>              "title": "Pré-requisitos Para Habilitação",</w:t>
+      </w:r>
+    </w:p>
+    <w:p>
+      <w:r>
+        <w:t>              "subtitle": null,</w:t>
       </w:r>
     </w:p>
     <w:p>
       <w:r>
         <w:lastRenderedPageBreak/>
-        <w:t>              "</w:t>
-      </w:r>
-      <w:proofErr w:type="spellStart"/>
-      <w:r>
-        <w:t>audio</w:t>
-      </w:r>
-      <w:proofErr w:type="spellEnd"/>
-      <w:r>
-        <w:t>": "",</w:t>
-      </w:r>
-    </w:p>
-    <w:p>
-      <w:r>
-        <w:t>              "</w:t>
-      </w:r>
-      <w:proofErr w:type="spellStart"/>
-      <w:r>
-        <w:t>elements</w:t>
-      </w:r>
-      <w:proofErr w:type="spellEnd"/>
-      <w:r>
-        <w:t>": [</w:t>
+        <w:t>              "audio": "",</w:t>
+      </w:r>
+    </w:p>
+    <w:p>
+      <w:r>
+        <w:t>              "elements": [</w:t>
       </w:r>
     </w:p>
     <w:p>
@@ -350,49 +172,17 @@
     </w:p>
     <w:p>
       <w:r>
-        <w:t>                  "</w:t>
-      </w:r>
-      <w:proofErr w:type="spellStart"/>
-      <w:r>
-        <w:t>type</w:t>
-      </w:r>
-      <w:proofErr w:type="spellEnd"/>
-      <w:r>
-        <w:t>": "</w:t>
-      </w:r>
-      <w:proofErr w:type="spellStart"/>
-      <w:r>
-        <w:t>TextElement</w:t>
-      </w:r>
-      <w:proofErr w:type="spellEnd"/>
-      <w:r>
-        <w:t>",</w:t>
-      </w:r>
-    </w:p>
-    <w:p>
-      <w:r>
-        <w:t>                  "</w:t>
-      </w:r>
-      <w:proofErr w:type="spellStart"/>
-      <w:r>
-        <w:t>styleName</w:t>
-      </w:r>
-      <w:proofErr w:type="spellEnd"/>
-      <w:r>
-        <w:t>": "title1",</w:t>
-      </w:r>
-    </w:p>
-    <w:p>
-      <w:r>
-        <w:t>                  "</w:t>
-      </w:r>
-      <w:proofErr w:type="spellStart"/>
-      <w:r>
-        <w:t>text</w:t>
-      </w:r>
-      <w:proofErr w:type="spellEnd"/>
-      <w:r>
-        <w:t>": "Pré-requisitos Para"</w:t>
+        <w:t>                  "type": "TextElement",</w:t>
+      </w:r>
+    </w:p>
+    <w:p>
+      <w:r>
+        <w:t>                  "styleName": "title1",</w:t>
+      </w:r>
+    </w:p>
+    <w:p>
+      <w:r>
+        <w:t>                  "text": "Pré-requisitos Para"</w:t>
       </w:r>
     </w:p>
     <w:p>
@@ -407,36 +197,12 @@
     </w:p>
     <w:p>
       <w:r>
-        <w:t>                  "</w:t>
-      </w:r>
-      <w:proofErr w:type="spellStart"/>
-      <w:r>
-        <w:t>type</w:t>
-      </w:r>
-      <w:proofErr w:type="spellEnd"/>
-      <w:r>
-        <w:t>": "</w:t>
-      </w:r>
-      <w:proofErr w:type="spellStart"/>
-      <w:r>
-        <w:t>GroupElement</w:t>
-      </w:r>
-      <w:proofErr w:type="spellEnd"/>
-      <w:r>
-        <w:t>",</w:t>
-      </w:r>
-    </w:p>
-    <w:p>
-      <w:r>
-        <w:t>                  "</w:t>
-      </w:r>
-      <w:proofErr w:type="spellStart"/>
-      <w:r>
-        <w:t>elements</w:t>
-      </w:r>
-      <w:proofErr w:type="spellEnd"/>
-      <w:r>
-        <w:t>": [</w:t>
+        <w:t>                  "type": "GroupElement",</w:t>
+      </w:r>
+    </w:p>
+    <w:p>
+      <w:r>
+        <w:t>                  "elements": [</w:t>
       </w:r>
     </w:p>
     <w:p>
@@ -446,57 +212,17 @@
     </w:p>
     <w:p>
       <w:r>
-        <w:t>                      "</w:t>
-      </w:r>
-      <w:proofErr w:type="spellStart"/>
-      <w:r>
-        <w:t>type</w:t>
-      </w:r>
-      <w:proofErr w:type="spellEnd"/>
-      <w:r>
-        <w:t>": "TextElement",</w:t>
-      </w:r>
-    </w:p>
-    <w:p>
-      <w:r>
-        <w:t>                      "</w:t>
-      </w:r>
-      <w:proofErr w:type="spellStart"/>
-      <w:r>
-        <w:t>styleName</w:t>
-      </w:r>
-      <w:proofErr w:type="spellEnd"/>
-      <w:r>
-        <w:t>": "</w:t>
-      </w:r>
-      <w:proofErr w:type="spellStart"/>
-      <w:r>
-        <w:t>paragraph</w:t>
-      </w:r>
-      <w:proofErr w:type="spellEnd"/>
-      <w:r>
-        <w:t>",</w:t>
-      </w:r>
-    </w:p>
-    <w:p>
-      <w:r>
-        <w:t>                      "</w:t>
-      </w:r>
-      <w:proofErr w:type="spellStart"/>
-      <w:r>
-        <w:t>text</w:t>
-      </w:r>
-      <w:proofErr w:type="spellEnd"/>
-      <w:r>
-        <w:t xml:space="preserve">": "Exemplo de texto dentro de um </w:t>
-      </w:r>
-      <w:proofErr w:type="spellStart"/>
-      <w:r>
-        <w:t>GroupElement</w:t>
-      </w:r>
-      <w:proofErr w:type="spellEnd"/>
-      <w:r>
-        <w:t>."</w:t>
+        <w:t>                      "type": "TextElement",</w:t>
+      </w:r>
+    </w:p>
+    <w:p>
+      <w:r>
+        <w:t>                      "styleName": "paragraph",</w:t>
+      </w:r>
+    </w:p>
+    <w:p>
+      <w:r>
+        <w:t>                      "text": "Exemplo de texto dentro de um GroupElement."</w:t>
       </w:r>
     </w:p>
     <w:p>
@@ -511,117 +237,37 @@
     </w:p>
     <w:p>
       <w:r>
-        <w:t>                      "</w:t>
-      </w:r>
-      <w:proofErr w:type="spellStart"/>
-      <w:r>
-        <w:t>type</w:t>
-      </w:r>
-      <w:proofErr w:type="spellEnd"/>
-      <w:r>
-        <w:t>": "ImageElement",</w:t>
-      </w:r>
-    </w:p>
-    <w:p>
-      <w:r>
-        <w:t>                      "</w:t>
-      </w:r>
-      <w:proofErr w:type="spellStart"/>
-      <w:r>
-        <w:t>title</w:t>
-      </w:r>
-      <w:proofErr w:type="spellEnd"/>
-      <w:r>
-        <w:t>": "Ilustração",</w:t>
-      </w:r>
-    </w:p>
-    <w:p>
-      <w:r>
-        <w:t>                      "</w:t>
-      </w:r>
-      <w:proofErr w:type="spellStart"/>
-      <w:r>
-        <w:t>legend</w:t>
-      </w:r>
-      <w:proofErr w:type="spellEnd"/>
-      <w:r>
-        <w:t>": "",</w:t>
-      </w:r>
-    </w:p>
-    <w:p>
-      <w:r>
-        <w:t>                      "</w:t>
-      </w:r>
-      <w:proofErr w:type="spellStart"/>
-      <w:r>
-        <w:t>source</w:t>
-      </w:r>
-      <w:proofErr w:type="spellEnd"/>
-      <w:r>
-        <w:t>": "exames para habilitação.swf",</w:t>
-      </w:r>
-    </w:p>
-    <w:p>
-      <w:r>
-        <w:t>                      "</w:t>
-      </w:r>
-      <w:proofErr w:type="spellStart"/>
-      <w:r>
-        <w:t>width</w:t>
-      </w:r>
-      <w:proofErr w:type="spellEnd"/>
-      <w:r>
-        <w:t>": 0,</w:t>
-      </w:r>
-    </w:p>
-    <w:p>
-      <w:r>
-        <w:t>                      "</w:t>
-      </w:r>
-      <w:proofErr w:type="spellStart"/>
-      <w:r>
-        <w:t>height</w:t>
-      </w:r>
-      <w:proofErr w:type="spellEnd"/>
-      <w:r>
-        <w:t>": 0,</w:t>
-      </w:r>
-    </w:p>
-    <w:p>
-      <w:r>
-        <w:t>                      "</w:t>
-      </w:r>
-      <w:proofErr w:type="spellStart"/>
-      <w:r>
-        <w:t>searchText</w:t>
-      </w:r>
-      <w:proofErr w:type="spellEnd"/>
-      <w:r>
-        <w:t>": "avaliação psicológica\</w:t>
-      </w:r>
-      <w:proofErr w:type="spellStart"/>
-      <w:r>
-        <w:t>nexame</w:t>
-      </w:r>
-      <w:proofErr w:type="spellEnd"/>
-      <w:r>
-        <w:t xml:space="preserve"> de aptidão física e mental\</w:t>
-      </w:r>
-      <w:proofErr w:type="spellStart"/>
-      <w:r>
-        <w:t>nexame</w:t>
-      </w:r>
-      <w:proofErr w:type="spellEnd"/>
-      <w:r>
-        <w:t xml:space="preserve"> direção veicular\</w:t>
-      </w:r>
-      <w:proofErr w:type="spellStart"/>
-      <w:r>
-        <w:t>nexame</w:t>
-      </w:r>
-      <w:proofErr w:type="spellEnd"/>
-      <w:r>
-        <w:t xml:space="preserve"> teórico-técnico"</w:t>
+        <w:t>                      "type": "ImageElement",</w:t>
+      </w:r>
+    </w:p>
+    <w:p>
+      <w:r>
+        <w:t>                      "title": "Ilustração",</w:t>
+      </w:r>
+    </w:p>
+    <w:p>
+      <w:r>
+        <w:t>                      "legend": "",</w:t>
+      </w:r>
+    </w:p>
+    <w:p>
+      <w:r>
+        <w:t>                      "source": "exames para habilitação.swf",</w:t>
+      </w:r>
+    </w:p>
+    <w:p>
+      <w:r>
+        <w:t>                      "width": 0,</w:t>
+      </w:r>
+    </w:p>
+    <w:p>
+      <w:r>
+        <w:t>                      "height": 0,</w:t>
+      </w:r>
+    </w:p>
+    <w:p>
+      <w:r>
+        <w:t>                      "searchText": "avaliação psicológica\nexame de aptidão física e mental\nexame direção veicular\nexame teórico-técnico"</w:t>
       </w:r>
     </w:p>
     <w:p>
@@ -636,79 +282,23 @@
     </w:p>
     <w:p>
       <w:r>
-        <w:t>                  "</w:t>
-      </w:r>
-      <w:proofErr w:type="spellStart"/>
-      <w:r>
-        <w:t>verticalAlign</w:t>
-      </w:r>
-      <w:proofErr w:type="spellEnd"/>
-      <w:r>
-        <w:t>": "</w:t>
-      </w:r>
-      <w:proofErr w:type="spellStart"/>
-      <w:r>
-        <w:t>middle</w:t>
-      </w:r>
-      <w:proofErr w:type="spellEnd"/>
-      <w:r>
-        <w:t>",</w:t>
-      </w:r>
-    </w:p>
-    <w:p>
-      <w:r>
-        <w:t>                  "</w:t>
-      </w:r>
-      <w:proofErr w:type="spellStart"/>
-      <w:r>
-        <w:t>mode</w:t>
-      </w:r>
-      <w:proofErr w:type="spellEnd"/>
-      <w:r>
-        <w:t>": "</w:t>
-      </w:r>
-      <w:proofErr w:type="spellStart"/>
-      <w:r>
-        <w:t>horizontalGroup</w:t>
-      </w:r>
-      <w:proofErr w:type="spellEnd"/>
-      <w:r>
-        <w:t>",</w:t>
+        <w:t>                  "verticalAlign": "middle",</w:t>
+      </w:r>
+    </w:p>
+    <w:p>
+      <w:r>
+        <w:t>                  "mode": "horizontalGroup",</w:t>
       </w:r>
     </w:p>
     <w:p>
       <w:r>
         <w:lastRenderedPageBreak/>
-        <w:t>                  "</w:t>
-      </w:r>
-      <w:proofErr w:type="spellStart"/>
-      <w:r>
-        <w:t>horizontalAlign</w:t>
-      </w:r>
-      <w:proofErr w:type="spellEnd"/>
-      <w:r>
-        <w:t>": "</w:t>
-      </w:r>
-      <w:proofErr w:type="spellStart"/>
-      <w:r>
-        <w:t>left</w:t>
-      </w:r>
-      <w:proofErr w:type="spellEnd"/>
-      <w:r>
-        <w:t>",</w:t>
-      </w:r>
-    </w:p>
-    <w:p>
-      <w:r>
-        <w:t>                  "</w:t>
-      </w:r>
-      <w:proofErr w:type="spellStart"/>
-      <w:r>
-        <w:t>fillHeight</w:t>
-      </w:r>
-      <w:proofErr w:type="spellEnd"/>
-      <w:r>
-        <w:t>": false</w:t>
+        <w:t>                  "horizontalAlign": "left",</w:t>
+      </w:r>
+    </w:p>
+    <w:p>
+      <w:r>
+        <w:t>                  "fillHeight": false</w:t>
       </w:r>
     </w:p>
     <w:p>
@@ -723,109 +313,22 @@
     </w:p>
     <w:p>
       <w:r>
-        <w:t>                  "</w:t>
-      </w:r>
-      <w:proofErr w:type="spellStart"/>
-      <w:r>
-        <w:t>type</w:t>
-      </w:r>
-      <w:proofErr w:type="spellEnd"/>
-      <w:r>
-        <w:t>": "</w:t>
-      </w:r>
-      <w:proofErr w:type="spellStart"/>
-      <w:r>
-        <w:t>ListElement</w:t>
-      </w:r>
-      <w:proofErr w:type="spellEnd"/>
-      <w:r>
-        <w:t>",</w:t>
-      </w:r>
-    </w:p>
-    <w:p>
-      <w:r>
-        <w:t>                  "</w:t>
-      </w:r>
-      <w:proofErr w:type="spellStart"/>
-      <w:r>
-        <w:t>styleName</w:t>
-      </w:r>
-      <w:proofErr w:type="spellEnd"/>
-      <w:r>
-        <w:t>": "</w:t>
-      </w:r>
-      <w:proofErr w:type="spellStart"/>
-      <w:r>
-        <w:t>unorderedList</w:t>
-      </w:r>
-      <w:proofErr w:type="spellEnd"/>
-      <w:r>
-        <w:t>",</w:t>
-      </w:r>
-    </w:p>
-    <w:p>
-      <w:r>
-        <w:t>                  "</w:t>
-      </w:r>
-      <w:proofErr w:type="spellStart"/>
-      <w:r>
-        <w:t>text</w:t>
-      </w:r>
-      <w:proofErr w:type="spellEnd"/>
-      <w:r>
-        <w:t>": "Ser penalmente imputável (que possa ser processado na forma da Lei</w:t>
-      </w:r>
-      <w:proofErr w:type="gramStart"/>
-      <w:r>
-        <w:t>);\</w:t>
-      </w:r>
-      <w:proofErr w:type="spellStart"/>
-      <w:proofErr w:type="gramEnd"/>
-      <w:r>
-        <w:t>nSaber</w:t>
-      </w:r>
-      <w:proofErr w:type="spellEnd"/>
-      <w:r>
-        <w:t xml:space="preserve"> ler e </w:t>
-      </w:r>
-      <w:proofErr w:type="gramStart"/>
-      <w:r>
-        <w:t>escrever;\</w:t>
-      </w:r>
-      <w:proofErr w:type="spellStart"/>
-      <w:proofErr w:type="gramEnd"/>
-      <w:r>
-        <w:t>nPossuir</w:t>
-      </w:r>
-      <w:proofErr w:type="spellEnd"/>
-      <w:r>
-        <w:t xml:space="preserve"> documento de </w:t>
-      </w:r>
-      <w:proofErr w:type="gramStart"/>
-      <w:r>
-        <w:t>identidade;\</w:t>
-      </w:r>
-      <w:proofErr w:type="spellStart"/>
-      <w:proofErr w:type="gramEnd"/>
-      <w:r>
-        <w:t>nPossuir</w:t>
-      </w:r>
-      <w:proofErr w:type="spellEnd"/>
-      <w:r>
-        <w:t xml:space="preserve"> Cadastro de Pessoa Física - CPF.\n",</w:t>
-      </w:r>
-    </w:p>
-    <w:p>
-      <w:r>
-        <w:t>                  "</w:t>
-      </w:r>
-      <w:proofErr w:type="spellStart"/>
-      <w:r>
-        <w:t>startIndex</w:t>
-      </w:r>
-      <w:proofErr w:type="spellEnd"/>
-      <w:r>
-        <w:t>": 1</w:t>
+        <w:t>                  "type": "ListElement",</w:t>
+      </w:r>
+    </w:p>
+    <w:p>
+      <w:r>
+        <w:t>                  "styleName": "unorderedList",</w:t>
+      </w:r>
+    </w:p>
+    <w:p>
+      <w:r>
+        <w:t>                  "text": "Ser penalmente imputável (que possa ser processado na forma da Lei);\nSaber ler e escrever;\nPossuir documento de identidade;\nPossuir Cadastro de Pessoa Física - CPF.\n",</w:t>
+      </w:r>
+    </w:p>
+    <w:p>
+      <w:r>
+        <w:t>                  "startIndex": 1</w:t>
       </w:r>
     </w:p>
     <w:p>
@@ -840,104 +343,22 @@
     </w:p>
     <w:p>
       <w:r>
-        <w:t>                  "</w:t>
-      </w:r>
-      <w:proofErr w:type="spellStart"/>
-      <w:r>
-        <w:t>type</w:t>
-      </w:r>
-      <w:proofErr w:type="spellEnd"/>
-      <w:r>
-        <w:t>": "</w:t>
-      </w:r>
-      <w:proofErr w:type="spellStart"/>
-      <w:r>
-        <w:t>ListElement</w:t>
-      </w:r>
-      <w:proofErr w:type="spellEnd"/>
-      <w:r>
-        <w:t>",</w:t>
-      </w:r>
-    </w:p>
-    <w:p>
-      <w:r>
-        <w:t>                  "</w:t>
-      </w:r>
-      <w:proofErr w:type="spellStart"/>
-      <w:r>
-        <w:t>styleName</w:t>
-      </w:r>
-      <w:proofErr w:type="spellEnd"/>
-      <w:r>
-        <w:t>": "</w:t>
-      </w:r>
-      <w:proofErr w:type="spellStart"/>
-      <w:r>
-        <w:t>numberList</w:t>
-      </w:r>
-      <w:proofErr w:type="spellEnd"/>
-      <w:r>
-        <w:t>",</w:t>
-      </w:r>
-    </w:p>
-    <w:p>
-      <w:r>
-        <w:t>                  "</w:t>
-      </w:r>
-      <w:proofErr w:type="spellStart"/>
-      <w:r>
-        <w:t>text</w:t>
-      </w:r>
-      <w:proofErr w:type="spellEnd"/>
-      <w:r>
-        <w:t xml:space="preserve">": "Primeiro </w:t>
-      </w:r>
-      <w:proofErr w:type="gramStart"/>
-      <w:r>
-        <w:t>passo;\</w:t>
-      </w:r>
-      <w:proofErr w:type="spellStart"/>
-      <w:proofErr w:type="gramEnd"/>
-      <w:r>
-        <w:t>nSegundo</w:t>
-      </w:r>
-      <w:proofErr w:type="spellEnd"/>
-      <w:r>
-        <w:t xml:space="preserve"> </w:t>
-      </w:r>
-      <w:proofErr w:type="gramStart"/>
-      <w:r>
-        <w:t>passo;\</w:t>
-      </w:r>
-      <w:proofErr w:type="spellStart"/>
-      <w:proofErr w:type="gramEnd"/>
-      <w:r>
-        <w:t>nTerceiro</w:t>
-      </w:r>
-      <w:proofErr w:type="spellEnd"/>
-      <w:r>
-        <w:t xml:space="preserve"> </w:t>
-      </w:r>
-      <w:proofErr w:type="gramStart"/>
-      <w:r>
-        <w:t>passo;\</w:t>
-      </w:r>
-      <w:proofErr w:type="gramEnd"/>
-      <w:r>
-        <w:t>n",</w:t>
-      </w:r>
-    </w:p>
-    <w:p>
-      <w:r>
-        <w:t>                  "</w:t>
-      </w:r>
-      <w:proofErr w:type="spellStart"/>
-      <w:r>
-        <w:t>startIndex</w:t>
-      </w:r>
-      <w:proofErr w:type="spellEnd"/>
-      <w:r>
-        <w:t>": 1</w:t>
+        <w:t>                  "type": "ListElement",</w:t>
+      </w:r>
+    </w:p>
+    <w:p>
+      <w:r>
+        <w:t>                  "styleName": "numberList",</w:t>
+      </w:r>
+    </w:p>
+    <w:p>
+      <w:r>
+        <w:t>                  "text": "Primeiro passo;\nSegundo passo;\nTerceiro passo;\n",</w:t>
+      </w:r>
+    </w:p>
+    <w:p>
+      <w:r>
+        <w:t>                  "startIndex": 1</w:t>
       </w:r>
     </w:p>
     <w:p>
@@ -952,49 +373,17 @@
     </w:p>
     <w:p>
       <w:r>
-        <w:t>                  "</w:t>
-      </w:r>
-      <w:proofErr w:type="spellStart"/>
-      <w:r>
-        <w:t>type</w:t>
-      </w:r>
-      <w:proofErr w:type="spellEnd"/>
-      <w:r>
-        <w:t>": "</w:t>
-      </w:r>
-      <w:proofErr w:type="spellStart"/>
-      <w:r>
-        <w:t>InfoBoxElement</w:t>
-      </w:r>
-      <w:proofErr w:type="spellEnd"/>
-      <w:r>
-        <w:t>",</w:t>
-      </w:r>
-    </w:p>
-    <w:p>
-      <w:r>
-        <w:t>                  "</w:t>
-      </w:r>
-      <w:proofErr w:type="spellStart"/>
-      <w:r>
-        <w:t>title</w:t>
-      </w:r>
-      <w:proofErr w:type="spellEnd"/>
-      <w:r>
-        <w:t>": "Info",</w:t>
-      </w:r>
-    </w:p>
-    <w:p>
-      <w:r>
-        <w:t>                  "</w:t>
-      </w:r>
-      <w:proofErr w:type="spellStart"/>
-      <w:r>
-        <w:t>elements</w:t>
-      </w:r>
-      <w:proofErr w:type="spellEnd"/>
-      <w:r>
-        <w:t>": [</w:t>
+        <w:t>                  "type": "InfoBoxElement",</w:t>
+      </w:r>
+    </w:p>
+    <w:p>
+      <w:r>
+        <w:t>                  "title": "Info",</w:t>
+      </w:r>
+    </w:p>
+    <w:p>
+      <w:r>
+        <w:t>                  "elements": [</w:t>
       </w:r>
     </w:p>
     <w:p>
@@ -1004,49 +393,17 @@
     </w:p>
     <w:p>
       <w:r>
-        <w:t>                      "</w:t>
-      </w:r>
-      <w:proofErr w:type="spellStart"/>
-      <w:r>
-        <w:t>type</w:t>
-      </w:r>
-      <w:proofErr w:type="spellEnd"/>
-      <w:r>
-        <w:t>": "TextElement",</w:t>
-      </w:r>
-    </w:p>
-    <w:p>
-      <w:r>
-        <w:t>                      "</w:t>
-      </w:r>
-      <w:proofErr w:type="spellStart"/>
-      <w:r>
-        <w:t>styleName</w:t>
-      </w:r>
-      <w:proofErr w:type="spellEnd"/>
-      <w:r>
-        <w:t>": "</w:t>
-      </w:r>
-      <w:proofErr w:type="spellStart"/>
-      <w:r>
-        <w:t>paragraph</w:t>
-      </w:r>
-      <w:proofErr w:type="spellEnd"/>
-      <w:r>
-        <w:t>",</w:t>
-      </w:r>
-    </w:p>
-    <w:p>
-      <w:r>
-        <w:t>                      "</w:t>
-      </w:r>
-      <w:proofErr w:type="spellStart"/>
-      <w:r>
-        <w:t>text</w:t>
-      </w:r>
-      <w:proofErr w:type="spellEnd"/>
-      <w:r>
-        <w:t>": "Você não poderá se habilitar ou se reabilitar se estiver respondendo por um delito de trânsito ou com sua habilitação suspensa ou cassada."</w:t>
+        <w:t>                      "type": "TextElement",</w:t>
+      </w:r>
+    </w:p>
+    <w:p>
+      <w:r>
+        <w:t>                      "styleName": "paragraph",</w:t>
+      </w:r>
+    </w:p>
+    <w:p>
+      <w:r>
+        <w:t>                      "text": "Você não poderá se habilitar ou se reabilitar se estiver respondendo por um delito de trânsito ou com sua habilitação suspensa ou cassada."</w:t>
       </w:r>
     </w:p>
     <w:p>
@@ -1061,71 +418,23 @@
     </w:p>
     <w:p>
       <w:r>
-        <w:t>                  "</w:t>
-      </w:r>
-      <w:proofErr w:type="spellStart"/>
-      <w:r>
-        <w:t>verticalAlign</w:t>
-      </w:r>
-      <w:proofErr w:type="spellEnd"/>
-      <w:r>
-        <w:t>": "top",</w:t>
+        <w:t>                  "verticalAlign": "top",</w:t>
       </w:r>
     </w:p>
     <w:p>
       <w:r>
         <w:lastRenderedPageBreak/>
-        <w:t>                  "</w:t>
-      </w:r>
-      <w:proofErr w:type="spellStart"/>
-      <w:r>
-        <w:t>mode</w:t>
-      </w:r>
-      <w:proofErr w:type="spellEnd"/>
-      <w:r>
-        <w:t>": "</w:t>
-      </w:r>
-      <w:proofErr w:type="spellStart"/>
-      <w:r>
-        <w:t>verticalGroup</w:t>
-      </w:r>
-      <w:proofErr w:type="spellEnd"/>
-      <w:r>
-        <w:t>",</w:t>
-      </w:r>
-    </w:p>
-    <w:p>
-      <w:r>
-        <w:t>                  "</w:t>
-      </w:r>
-      <w:proofErr w:type="spellStart"/>
-      <w:r>
-        <w:t>horizontalAlign</w:t>
-      </w:r>
-      <w:proofErr w:type="spellEnd"/>
-      <w:r>
-        <w:t>": "</w:t>
-      </w:r>
-      <w:proofErr w:type="spellStart"/>
-      <w:r>
-        <w:t>left</w:t>
-      </w:r>
-      <w:proofErr w:type="spellEnd"/>
-      <w:r>
-        <w:t>",</w:t>
-      </w:r>
-    </w:p>
-    <w:p>
-      <w:r>
-        <w:t>                  "</w:t>
-      </w:r>
-      <w:proofErr w:type="spellStart"/>
-      <w:r>
-        <w:t>fillHeight</w:t>
-      </w:r>
-      <w:proofErr w:type="spellEnd"/>
-      <w:r>
-        <w:t>": false,</w:t>
+        <w:t>                  "mode": "verticalGroup",</w:t>
+      </w:r>
+    </w:p>
+    <w:p>
+      <w:r>
+        <w:t>                  "horizontalAlign": "left",</w:t>
+      </w:r>
+    </w:p>
+    <w:p>
+      <w:r>
+        <w:t>                  "fillHeight": false,</w:t>
       </w:r>
     </w:p>
     <w:p>
@@ -1150,96 +459,32 @@
     </w:p>
     <w:p>
       <w:r>
-        <w:t>                  "</w:t>
-      </w:r>
-      <w:proofErr w:type="spellStart"/>
-      <w:r>
-        <w:t>type</w:t>
-      </w:r>
-      <w:proofErr w:type="spellEnd"/>
-      <w:r>
-        <w:t>": "</w:t>
-      </w:r>
-      <w:proofErr w:type="spellStart"/>
-      <w:r>
-        <w:t>GridElement</w:t>
-      </w:r>
-      <w:proofErr w:type="spellEnd"/>
-      <w:r>
-        <w:t>",</w:t>
-      </w:r>
-    </w:p>
-    <w:p>
-      <w:r>
-        <w:t>                  "</w:t>
-      </w:r>
-      <w:proofErr w:type="spellStart"/>
-      <w:r>
-        <w:t>alternateRowColor</w:t>
-      </w:r>
-      <w:proofErr w:type="spellEnd"/>
-      <w:r>
-        <w:t xml:space="preserve">": </w:t>
-      </w:r>
-      <w:proofErr w:type="spellStart"/>
-      <w:r>
-        <w:t>true</w:t>
-      </w:r>
-      <w:proofErr w:type="spellEnd"/>
-      <w:r>
-        <w:t>,</w:t>
-      </w:r>
-    </w:p>
-    <w:p>
-      <w:r>
-        <w:t>                  "</w:t>
-      </w:r>
-      <w:proofErr w:type="spellStart"/>
-      <w:r>
-        <w:t>columnNumber</w:t>
-      </w:r>
-      <w:proofErr w:type="spellEnd"/>
-      <w:r>
-        <w:t>": 3,</w:t>
-      </w:r>
-    </w:p>
-    <w:p>
-      <w:r>
-        <w:t>                  "</w:t>
-      </w:r>
-      <w:proofErr w:type="spellStart"/>
-      <w:r>
-        <w:t>featureColumn</w:t>
-      </w:r>
-      <w:proofErr w:type="spellEnd"/>
-      <w:r>
-        <w:t>": 1,</w:t>
-      </w:r>
-    </w:p>
-    <w:p>
-      <w:r>
-        <w:t>                  "</w:t>
-      </w:r>
-      <w:proofErr w:type="spellStart"/>
-      <w:r>
-        <w:t>columnSizes</w:t>
-      </w:r>
-      <w:proofErr w:type="spellEnd"/>
-      <w:r>
-        <w:t>": [2.5, 2.5, 2.5],</w:t>
-      </w:r>
-    </w:p>
-    <w:p>
-      <w:r>
-        <w:t>                  "</w:t>
-      </w:r>
-      <w:proofErr w:type="spellStart"/>
-      <w:r>
-        <w:t>content</w:t>
-      </w:r>
-      <w:proofErr w:type="spellEnd"/>
-      <w:r>
-        <w:t>": [</w:t>
+        <w:t>                  "type": "GridElement",</w:t>
+      </w:r>
+    </w:p>
+    <w:p>
+      <w:r>
+        <w:t>                  "alternateRowColor": true,</w:t>
+      </w:r>
+    </w:p>
+    <w:p>
+      <w:r>
+        <w:t>                  "columnNumber": 3,</w:t>
+      </w:r>
+    </w:p>
+    <w:p>
+      <w:r>
+        <w:t>                  "featureColumn": 1,</w:t>
+      </w:r>
+    </w:p>
+    <w:p>
+      <w:r>
+        <w:t>                  "columnSizes": [2.5, 2.5, 2.5],</w:t>
+      </w:r>
+    </w:p>
+    <w:p>
+      <w:r>
+        <w:t>                  "content": [</w:t>
       </w:r>
     </w:p>
     <w:p>
@@ -1259,15 +504,7 @@
     </w:p>
     <w:p>
       <w:r>
-        <w:t xml:space="preserve">                    ["Adição </w:t>
-      </w:r>
-      <w:proofErr w:type="spellStart"/>
-      <w:r>
-        <w:t>Cat</w:t>
-      </w:r>
-      <w:proofErr w:type="spellEnd"/>
-      <w:r>
-        <w:t xml:space="preserve"> A", "---", "15 h."],</w:t>
+        <w:t>                    ["Adição Cat A", "---", "15 h."],</w:t>
       </w:r>
     </w:p>
     <w:p>
@@ -1277,15 +514,7 @@
     </w:p>
     <w:p>
       <w:r>
-        <w:t xml:space="preserve">                    ["Adição </w:t>
-      </w:r>
-      <w:proofErr w:type="spellStart"/>
-      <w:r>
-        <w:t>Cat</w:t>
-      </w:r>
-      <w:proofErr w:type="spellEnd"/>
-      <w:r>
-        <w:t xml:space="preserve"> B", "---", "15 h."]</w:t>
+        <w:t>                    ["Adição Cat B", "---", "15 h."]</w:t>
       </w:r>
     </w:p>
     <w:p>
@@ -1295,15 +524,7 @@
     </w:p>
     <w:p>
       <w:r>
-        <w:t>                  "</w:t>
-      </w:r>
-      <w:proofErr w:type="spellStart"/>
-      <w:r>
-        <w:t>isFirstRowHeader</w:t>
-      </w:r>
-      <w:proofErr w:type="spellEnd"/>
-      <w:r>
-        <w:t>": true</w:t>
+        <w:t>                  "isFirstRowHeader": true</w:t>
       </w:r>
     </w:p>
     <w:p>
@@ -1318,70 +539,22 @@
     </w:p>
     <w:p>
       <w:r>
-        <w:t>                  "</w:t>
-      </w:r>
-      <w:proofErr w:type="spellStart"/>
-      <w:r>
-        <w:t>type</w:t>
-      </w:r>
-      <w:proofErr w:type="spellEnd"/>
-      <w:r>
-        <w:t>": "</w:t>
-      </w:r>
-      <w:proofErr w:type="spellStart"/>
-      <w:r>
-        <w:t>VideoElement</w:t>
-      </w:r>
-      <w:proofErr w:type="spellEnd"/>
-      <w:r>
-        <w:t>",</w:t>
-      </w:r>
-    </w:p>
-    <w:p>
-      <w:r>
-        <w:t>                  "</w:t>
-      </w:r>
-      <w:proofErr w:type="spellStart"/>
-      <w:r>
-        <w:t>title</w:t>
-      </w:r>
-      <w:proofErr w:type="spellEnd"/>
-      <w:r>
-        <w:t>": "Vídeo",</w:t>
-      </w:r>
-    </w:p>
-    <w:p>
-      <w:r>
-        <w:t>                  "</w:t>
-      </w:r>
-      <w:proofErr w:type="spellStart"/>
-      <w:r>
-        <w:t>previewImage</w:t>
-      </w:r>
-      <w:proofErr w:type="spellEnd"/>
-      <w:r>
-        <w:t>": "direcao-defensiva-condicoes-do-condutor-via-usuario.jpg",</w:t>
-      </w:r>
-    </w:p>
-    <w:p>
-      <w:r>
-        <w:t>                  "</w:t>
-      </w:r>
-      <w:proofErr w:type="spellStart"/>
-      <w:r>
-        <w:t>video</w:t>
-      </w:r>
-      <w:proofErr w:type="spellEnd"/>
-      <w:r>
-        <w:t>": "https://www.youtube.com/</w:t>
-      </w:r>
-      <w:proofErr w:type="spellStart"/>
-      <w:r>
-        <w:t>watch?v</w:t>
-      </w:r>
-      <w:proofErr w:type="spellEnd"/>
-      <w:r>
-        <w:t>=VIDEO_ID"</w:t>
+        <w:t>                  "type": "VideoElement",</w:t>
+      </w:r>
+    </w:p>
+    <w:p>
+      <w:r>
+        <w:t>                  "title": "Vídeo",</w:t>
+      </w:r>
+    </w:p>
+    <w:p>
+      <w:r>
+        <w:t>                  "previewImage": "direcao-defensiva-condicoes-do-condutor-via-usuario.jpg",</w:t>
+      </w:r>
+    </w:p>
+    <w:p>
+      <w:r>
+        <w:t>                  "video": "https://www.youtube.com/watch?v=VIDEO_ID"</w:t>
       </w:r>
     </w:p>
     <w:p>
@@ -1397,23 +570,7 @@
     </w:p>
     <w:p>
       <w:r>
-        <w:t>                  "</w:t>
-      </w:r>
-      <w:proofErr w:type="spellStart"/>
-      <w:r>
-        <w:t>type</w:t>
-      </w:r>
-      <w:proofErr w:type="spellEnd"/>
-      <w:r>
-        <w:t>": "</w:t>
-      </w:r>
-      <w:proofErr w:type="spellStart"/>
-      <w:r>
-        <w:t>AppLauncherElement</w:t>
-      </w:r>
-      <w:proofErr w:type="spellEnd"/>
-      <w:r>
-        <w:t>",</w:t>
+        <w:t>                  "type": "AppLauncherElement",</w:t>
       </w:r>
     </w:p>
     <w:p>
@@ -1617,35 +774,9 @@
           <w:sz w:val="52"/>
           <w:szCs w:val="52"/>
         </w:rPr>
-        <w:t>Este é o style.css:</w:t>
-      </w:r>
-    </w:p>
-    <w:p>
-      <w:hyperlink r:id="rId7" w:history="1">
-        <w:r>
-          <w:rPr>
-            <w:rStyle w:val="Hyperlink"/>
-          </w:rPr>
-          <w:t>https://raw.githubusercontent.com/AlexBrazil/Multimidia_Web/refs/heads/main/css/style.css</w:t>
-        </w:r>
-      </w:hyperlink>
-    </w:p>
-    <w:p>
-      <w:pPr>
-        <w:rPr>
-          <w:rStyle w:val="Hyperlink"/>
-        </w:rPr>
-      </w:pPr>
-    </w:p>
-    <w:p>
-      <w:pPr>
-        <w:rPr>
-          <w:rStyle w:val="Hyperlink"/>
-        </w:rPr>
-      </w:pPr>
-    </w:p>
-    <w:p>
-      <w:pPr>
+        <w:t xml:space="preserve">Este é o </w:t>
+      </w:r>
+      <w:r>
         <w:rPr>
           <w:b/>
           <w:bCs/>
@@ -1653,7 +784,8 @@
           <w:sz w:val="52"/>
           <w:szCs w:val="52"/>
         </w:rPr>
-      </w:pPr>
+        <w:t>data.json completo</w:t>
+      </w:r>
       <w:r>
         <w:rPr>
           <w:b/>
@@ -1662,41 +794,6 @@
           <w:sz w:val="52"/>
           <w:szCs w:val="52"/>
         </w:rPr>
-        <w:lastRenderedPageBreak/>
-        <w:t xml:space="preserve">Este é o </w:t>
-      </w:r>
-      <w:proofErr w:type="spellStart"/>
-      <w:proofErr w:type="gramStart"/>
-      <w:r>
-        <w:rPr>
-          <w:b/>
-          <w:bCs/>
-          <w:color w:val="EE0000"/>
-          <w:sz w:val="52"/>
-          <w:szCs w:val="52"/>
-        </w:rPr>
-        <w:t>data.json</w:t>
-      </w:r>
-      <w:proofErr w:type="spellEnd"/>
-      <w:proofErr w:type="gramEnd"/>
-      <w:r>
-        <w:rPr>
-          <w:b/>
-          <w:bCs/>
-          <w:color w:val="EE0000"/>
-          <w:sz w:val="52"/>
-          <w:szCs w:val="52"/>
-        </w:rPr>
-        <w:t xml:space="preserve"> completo</w:t>
-      </w:r>
-      <w:r>
-        <w:rPr>
-          <w:b/>
-          <w:bCs/>
-          <w:color w:val="EE0000"/>
-          <w:sz w:val="52"/>
-          <w:szCs w:val="52"/>
-        </w:rPr>
         <w:t>:</w:t>
       </w:r>
     </w:p>
@@ -1706,7 +803,7 @@
           <w:rStyle w:val="Hyperlink"/>
         </w:rPr>
       </w:pPr>
-      <w:hyperlink r:id="rId8" w:history="1">
+      <w:hyperlink r:id="rId7" w:history="1">
         <w:r>
           <w:rPr>
             <w:rStyle w:val="Hyperlink"/>
@@ -1722,82 +819,87 @@
           <w:u w:val="none"/>
         </w:rPr>
       </w:pPr>
-    </w:p>
-    <w:p>
-      <w:pPr>
+      <w:r>
         <w:rPr>
           <w:rStyle w:val="Hyperlink"/>
           <w:u w:val="none"/>
         </w:rPr>
-      </w:pPr>
+        <w:t>Agora segue os tipos de elementos dos slides que podem ser renderizados</w:t>
+      </w:r>
       <w:r>
         <w:rPr>
           <w:rStyle w:val="Hyperlink"/>
           <w:u w:val="none"/>
         </w:rPr>
-        <w:t>Agora segue os tipos de elementos dos slides que podem ser renderizados:</w:t>
-      </w:r>
-    </w:p>
-    <w:p>
-      <w:pPr>
-        <w:rPr>
-          <w:b/>
-          <w:bCs/>
-        </w:rPr>
-      </w:pPr>
-      <w:r>
-        <w:rPr>
-          <w:b/>
-          <w:bCs/>
-        </w:rPr>
-        <w:t xml:space="preserve">Tipo </w:t>
-      </w:r>
-      <w:proofErr w:type="spellStart"/>
-      <w:r>
-        <w:rPr>
-          <w:b/>
-          <w:bCs/>
-        </w:rPr>
-        <w:t>TextElement</w:t>
-      </w:r>
-      <w:proofErr w:type="spellEnd"/>
-      <w:r>
-        <w:rPr>
-          <w:b/>
-          <w:bCs/>
-        </w:rPr>
-        <w:t xml:space="preserve"> - </w:t>
-      </w:r>
-      <w:r>
-        <w:rPr>
-          <w:b/>
-          <w:bCs/>
-        </w:rPr>
-        <w:t>Um trecho de texto</w:t>
-      </w:r>
-      <w:r>
-        <w:rPr>
-          <w:b/>
-          <w:bCs/>
-        </w:rPr>
-        <w:t xml:space="preserve"> - </w:t>
-      </w:r>
-      <w:r>
-        <w:rPr>
-          <w:b/>
-          <w:bCs/>
-        </w:rPr>
-        <w:t>text-element.js</w:t>
-      </w:r>
-    </w:p>
-    <w:p>
-      <w:pPr>
+        <w:t xml:space="preserve"> com seus respectivos css</w:t>
+      </w:r>
+      <w:r>
         <w:rPr>
           <w:rStyle w:val="Hyperlink"/>
           <w:u w:val="none"/>
         </w:rPr>
-      </w:pPr>
-      <w:hyperlink r:id="rId9" w:history="1">
+        <w:t>:</w:t>
+      </w:r>
+    </w:p>
+    <w:p>
+      <w:pPr>
+        <w:rPr>
+          <w:b/>
+          <w:bCs/>
+        </w:rPr>
+      </w:pPr>
+      <w:r>
+        <w:rPr>
+          <w:b/>
+          <w:bCs/>
+        </w:rPr>
+        <w:lastRenderedPageBreak/>
+        <w:t xml:space="preserve">Tipo </w:t>
+      </w:r>
+      <w:r>
+        <w:rPr>
+          <w:b/>
+          <w:bCs/>
+        </w:rPr>
+        <w:t>TextElement</w:t>
+      </w:r>
+      <w:r>
+        <w:rPr>
+          <w:b/>
+          <w:bCs/>
+        </w:rPr>
+        <w:t xml:space="preserve"> - </w:t>
+      </w:r>
+      <w:r>
+        <w:rPr>
+          <w:b/>
+          <w:bCs/>
+        </w:rPr>
+        <w:t>Um trecho de texto</w:t>
+      </w:r>
+      <w:r>
+        <w:rPr>
+          <w:b/>
+          <w:bCs/>
+        </w:rPr>
+        <w:t xml:space="preserve"> - </w:t>
+      </w:r>
+      <w:r>
+        <w:rPr>
+          <w:b/>
+          <w:bCs/>
+        </w:rPr>
+        <w:t>text-element.js</w:t>
+      </w:r>
+    </w:p>
+    <w:p>
+      <w:pPr>
+        <w:rPr>
+          <w:rStyle w:val="Hyperlink"/>
+          <w:u w:val="none"/>
+        </w:rPr>
+      </w:pPr>
+      <w:hyperlink r:id="rId8" w:history="1">
         <w:r>
           <w:rPr>
             <w:rStyle w:val="Hyperlink"/>
@@ -1821,21 +923,12 @@
           <w:bCs/>
         </w:rPr>
       </w:pPr>
-      <w:proofErr w:type="spellStart"/>
-      <w:r>
-        <w:rPr>
-          <w:b/>
-          <w:bCs/>
-        </w:rPr>
-        <w:t>ListElement</w:t>
-      </w:r>
-      <w:proofErr w:type="spellEnd"/>
-      <w:r>
-        <w:rPr>
-          <w:b/>
-          <w:bCs/>
-        </w:rPr>
-        <w:t>: Uma lista com marcadores ou numerada</w:t>
+      <w:r>
+        <w:rPr>
+          <w:b/>
+          <w:bCs/>
+        </w:rPr>
+        <w:t>ListElement: Uma lista com marcadores ou numerada</w:t>
       </w:r>
       <w:r>
         <w:rPr>
@@ -1859,7 +952,7 @@
           <w:u w:val="none"/>
         </w:rPr>
       </w:pPr>
-      <w:hyperlink r:id="rId10" w:history="1">
+      <w:hyperlink r:id="rId9" w:history="1">
         <w:r>
           <w:rPr>
             <w:rStyle w:val="Hyperlink"/>
@@ -1883,7 +976,6 @@
           <w:bCs/>
         </w:rPr>
       </w:pPr>
-      <w:proofErr w:type="spellStart"/>
       <w:r>
         <w:rPr>
           <w:b/>
@@ -1891,7 +983,6 @@
         </w:rPr>
         <w:t>VideoElement</w:t>
       </w:r>
-      <w:proofErr w:type="spellEnd"/>
       <w:r>
         <w:rPr>
           <w:b/>
@@ -1911,39 +1002,14 @@
           <w:b/>
           <w:bCs/>
         </w:rPr>
-        <w:t xml:space="preserve"> </w:t>
-      </w:r>
-      <w:proofErr w:type="spellStart"/>
-      <w:r>
-        <w:rPr>
-          <w:b/>
-          <w:bCs/>
-        </w:rPr>
-        <w:t>youtube</w:t>
-      </w:r>
-      <w:proofErr w:type="spellEnd"/>
-      <w:r>
-        <w:rPr>
-          <w:b/>
-          <w:bCs/>
-        </w:rPr>
-        <w:t xml:space="preserve">, mídia direta e </w:t>
-      </w:r>
-      <w:proofErr w:type="spellStart"/>
-      <w:r>
-        <w:rPr>
-          <w:b/>
-          <w:bCs/>
-        </w:rPr>
-        <w:t>Fallback</w:t>
-      </w:r>
-      <w:proofErr w:type="spellEnd"/>
-      <w:r>
-        <w:rPr>
-          <w:b/>
-          <w:bCs/>
-        </w:rPr>
-        <w:t xml:space="preserve"> para links externos</w:t>
+        <w:t xml:space="preserve"> youtube, mídia direta e </w:t>
+      </w:r>
+      <w:r>
+        <w:rPr>
+          <w:b/>
+          <w:bCs/>
+        </w:rPr>
+        <w:t>Fallback para links externos</w:t>
       </w:r>
       <w:r>
         <w:rPr>
@@ -1961,7 +1027,7 @@
       </w:r>
     </w:p>
     <w:p>
-      <w:hyperlink r:id="rId11" w:history="1">
+      <w:hyperlink r:id="rId10" w:history="1">
         <w:r>
           <w:rPr>
             <w:rStyle w:val="Hyperlink"/>
@@ -1985,21 +1051,12 @@
           <w:bCs/>
         </w:rPr>
       </w:pPr>
-      <w:proofErr w:type="spellStart"/>
-      <w:r>
-        <w:rPr>
-          <w:b/>
-          <w:bCs/>
-        </w:rPr>
-        <w:t>SpacerElement</w:t>
-      </w:r>
-      <w:proofErr w:type="spellEnd"/>
-      <w:r>
-        <w:rPr>
-          <w:b/>
-          <w:bCs/>
-        </w:rPr>
-        <w:t>: Usado para layout, para criar um espaço vazio</w:t>
+      <w:r>
+        <w:rPr>
+          <w:b/>
+          <w:bCs/>
+        </w:rPr>
+        <w:t>SpacerElement: Usado para layout, para criar um espaço vazio</w:t>
       </w:r>
       <w:r>
         <w:rPr>
@@ -2017,7 +1074,7 @@
       </w:r>
     </w:p>
     <w:p>
-      <w:hyperlink r:id="rId12" w:history="1">
+      <w:hyperlink r:id="rId11" w:history="1">
         <w:r>
           <w:rPr>
             <w:rStyle w:val="Hyperlink"/>
@@ -2041,21 +1098,12 @@
           <w:bCs/>
         </w:rPr>
       </w:pPr>
-      <w:proofErr w:type="spellStart"/>
-      <w:r>
-        <w:rPr>
-          <w:b/>
-          <w:bCs/>
-        </w:rPr>
-        <w:t>GridElement</w:t>
-      </w:r>
-      <w:proofErr w:type="spellEnd"/>
-      <w:r>
-        <w:rPr>
-          <w:b/>
-          <w:bCs/>
-        </w:rPr>
-        <w:t>: Uma grade ou tabela</w:t>
+      <w:r>
+        <w:rPr>
+          <w:b/>
+          <w:bCs/>
+        </w:rPr>
+        <w:t>GridElement: Uma grade ou tabela</w:t>
       </w:r>
       <w:r>
         <w:rPr>
@@ -2079,7 +1127,7 @@
           <w:bCs/>
         </w:rPr>
       </w:pPr>
-      <w:hyperlink r:id="rId13" w:history="1">
+      <w:hyperlink r:id="rId12" w:history="1">
         <w:r>
           <w:rPr>
             <w:rStyle w:val="Hyperlink"/>
@@ -2105,21 +1153,12 @@
           <w:bCs/>
         </w:rPr>
       </w:pPr>
-      <w:proofErr w:type="spellStart"/>
-      <w:r>
-        <w:rPr>
-          <w:b/>
-          <w:bCs/>
-        </w:rPr>
-        <w:t>GroupElement</w:t>
-      </w:r>
-      <w:proofErr w:type="spellEnd"/>
-      <w:r>
-        <w:rPr>
-          <w:b/>
-          <w:bCs/>
-        </w:rPr>
-        <w:t>: Um contêiner para agrupar outros elementos para fins de layout</w:t>
+      <w:r>
+        <w:rPr>
+          <w:b/>
+          <w:bCs/>
+        </w:rPr>
+        <w:t>GroupElement: Um contêiner para agrupar outros elementos para fins de layout</w:t>
       </w:r>
       <w:r>
         <w:rPr>
@@ -2143,7 +1182,7 @@
           <w:bCs/>
         </w:rPr>
       </w:pPr>
-      <w:hyperlink r:id="rId14" w:history="1">
+      <w:hyperlink r:id="rId13" w:history="1">
         <w:r>
           <w:rPr>
             <w:rStyle w:val="Hyperlink"/>
@@ -2161,38 +1200,12 @@
           <w:bCs/>
         </w:rPr>
       </w:pPr>
-      <w:proofErr w:type="spellStart"/>
-      <w:r>
-        <w:rPr>
-          <w:b/>
-          <w:bCs/>
-        </w:rPr>
-        <w:lastRenderedPageBreak/>
-        <w:t>InfoBoxElement</w:t>
-      </w:r>
-      <w:proofErr w:type="spellEnd"/>
-      <w:r>
-        <w:rPr>
-          <w:b/>
-          <w:bCs/>
-        </w:rPr>
-        <w:t>: Um tipo especial de </w:t>
-      </w:r>
-      <w:proofErr w:type="spellStart"/>
-      <w:r>
-        <w:rPr>
-          <w:b/>
-          <w:bCs/>
-        </w:rPr>
-        <w:t>GroupElement</w:t>
-      </w:r>
-      <w:proofErr w:type="spellEnd"/>
-      <w:r>
-        <w:rPr>
-          <w:b/>
-          <w:bCs/>
-        </w:rPr>
-        <w:t> que aparece como uma caixa de destaque estilizada</w:t>
+      <w:r>
+        <w:rPr>
+          <w:b/>
+          <w:bCs/>
+        </w:rPr>
+        <w:t>InfoBoxElement: Um tipo especial de GroupElement que aparece como uma caixa de destaque estilizada</w:t>
       </w:r>
       <w:r>
         <w:rPr>
@@ -2203,7 +1216,7 @@
       </w:r>
     </w:p>
     <w:p>
-      <w:hyperlink r:id="rId15" w:history="1">
+      <w:hyperlink r:id="rId14" w:history="1">
         <w:r>
           <w:rPr>
             <w:rStyle w:val="Hyperlink"/>
@@ -2222,21 +1235,9 @@
       </w:pPr>
     </w:p>
     <w:p>
-      <w:proofErr w:type="spellStart"/>
-      <w:r>
-        <w:t>ImageElement</w:t>
-      </w:r>
-      <w:proofErr w:type="spellEnd"/>
-      <w:r>
-        <w:t xml:space="preserve">: Renderização de imagens com suporte a legenda e </w:t>
-      </w:r>
-      <w:proofErr w:type="spellStart"/>
-      <w:r>
-        <w:t>fallback</w:t>
-      </w:r>
-      <w:proofErr w:type="spellEnd"/>
-      <w:r>
-        <w:t xml:space="preserve"> Flash - image-element.js </w:t>
+      <w:r>
+        <w:lastRenderedPageBreak/>
+        <w:t xml:space="preserve">ImageElement: Renderização de imagens com suporte a legenda e fallback Flash - image-element.js </w:t>
       </w:r>
     </w:p>
     <w:p>
@@ -2247,7 +1248,7 @@
           <w:u w:val="single"/>
         </w:rPr>
       </w:pPr>
-      <w:hyperlink r:id="rId16" w:history="1">
+      <w:hyperlink r:id="rId15" w:history="1">
         <w:r>
           <w:rPr>
             <w:rStyle w:val="Hyperlink"/>
@@ -2260,27 +1261,9 @@
     </w:p>
     <w:p>
       <w:r>
-        <w:t xml:space="preserve"> </w:t>
-      </w:r>
-    </w:p>
-    <w:p>
-      <w:proofErr w:type="spellStart"/>
-      <w:r>
-        <w:t>AppLauncherElement</w:t>
-      </w:r>
-      <w:proofErr w:type="spellEnd"/>
-      <w:r>
-        <w:t xml:space="preserve">: Lançador de aplicativos/jogos externos (ZIP ou </w:t>
-      </w:r>
-      <w:proofErr w:type="spellStart"/>
-      <w:r>
-        <w:t>WebGL</w:t>
-      </w:r>
-      <w:proofErr w:type="spellEnd"/>
-      <w:r>
-        <w:t xml:space="preserve">) - app-launcher.js </w:t>
-      </w:r>
-      <w:hyperlink r:id="rId17" w:history="1">
+        <w:t xml:space="preserve"> AppLauncherElement: Lançador de aplicativos/jogos externos (ZIP ou WebGL) - app-launcher.js </w:t>
+      </w:r>
+      <w:hyperlink r:id="rId16" w:history="1">
         <w:r>
           <w:rPr>
             <w:rStyle w:val="Hyperlink"/>
@@ -2291,7 +1274,24 @@
         </w:r>
       </w:hyperlink>
     </w:p>
-    <w:p/>
+    <w:p>
+      <w:r>
+        <w:t>card-image-element.js</w:t>
+      </w:r>
+      <w:r>
+        <w:t>: imagem em formato de card, com zoom ou abertura de modal ao ser clicado.</w:t>
+      </w:r>
+    </w:p>
+    <w:p>
+      <w:hyperlink r:id="rId17" w:history="1">
+        <w:r>
+          <w:rPr>
+            <w:rStyle w:val="Hyperlink"/>
+          </w:rPr>
+          <w:t>https://raw.githubusercontent.com/AlexBrazil/Multimidia_Web/refs/heads/main/js/elements/card-image-element.js</w:t>
+        </w:r>
+      </w:hyperlink>
+    </w:p>
     <w:p>
       <w:r>
         <w:t>base.js: Utilitários compartilhados entre todos os elementos do slide. Centraliza funcionalidades comuns para evitar duplicação</w:t>
@@ -2318,15 +1318,7 @@
         </w:rPr>
       </w:pPr>
       <w:r>
-        <w:t xml:space="preserve">Acesse casa link </w:t>
-      </w:r>
-      <w:proofErr w:type="spellStart"/>
-      <w:r>
-        <w:t>raw</w:t>
-      </w:r>
-      <w:proofErr w:type="spellEnd"/>
-      <w:r>
-        <w:t xml:space="preserve"> para entender de forma completa como os slides são renderizados e como ocorre a navegação pelos mesmos.</w:t>
+        <w:t>Acesse casa link raw para entender de forma completa como os slides são renderizados e como ocorre a navegação pelos mesmos.</w:t>
       </w:r>
     </w:p>
     <w:p>

</xml_diff>

<commit_message>
Refatorado a barra de slide footer para mobile, para não fical oculta por barra e navegação android
</commit_message>
<xml_diff>
--- a/Documentos/Explica_Projeto.docx
+++ b/Documentos/Explica_Projeto.docx
@@ -4,7 +4,15 @@
   <w:body>
     <w:p>
       <w:r>
-        <w:t>Vou lhe explicar um projeto de uma aplicação Web que usa como base dos dados um json.</w:t>
+        <w:t xml:space="preserve">Vou lhe explicar um projeto de uma aplicação Web que usa como base dos dados um </w:t>
+      </w:r>
+      <w:proofErr w:type="spellStart"/>
+      <w:r>
+        <w:t>json</w:t>
+      </w:r>
+      <w:proofErr w:type="spellEnd"/>
+      <w:r>
+        <w:t>.</w:t>
       </w:r>
     </w:p>
     <w:p>
@@ -12,7 +20,15 @@
         <w:t>Apenas entenda cada linha de código</w:t>
       </w:r>
       <w:r>
-        <w:t xml:space="preserve"> acessando os links raw abaixo</w:t>
+        <w:t xml:space="preserve"> acessando os links </w:t>
+      </w:r>
+      <w:proofErr w:type="spellStart"/>
+      <w:r>
+        <w:t>raw</w:t>
+      </w:r>
+      <w:proofErr w:type="spellEnd"/>
+      <w:r>
+        <w:t xml:space="preserve"> abaixo</w:t>
       </w:r>
       <w:r>
         <w:t>, sua lógica e regras de renderização de conteúdo. Não precisa sugerir nenhuma refatoração por enquanto.</w:t>
@@ -22,6 +38,7 @@
       <w:r>
         <w:t xml:space="preserve">Este </w:t>
       </w:r>
+      <w:proofErr w:type="spellStart"/>
       <w:r>
         <w:rPr>
           <w:b/>
@@ -32,6 +49,7 @@
         </w:rPr>
         <w:t>json</w:t>
       </w:r>
+      <w:proofErr w:type="spellEnd"/>
       <w:r>
         <w:rPr>
           <w:color w:val="EE0000"/>
@@ -51,7 +69,23 @@
     </w:p>
     <w:p>
       <w:r>
-        <w:t>  "type": "SlideGroup",</w:t>
+        <w:t>  "</w:t>
+      </w:r>
+      <w:proofErr w:type="spellStart"/>
+      <w:r>
+        <w:t>type</w:t>
+      </w:r>
+      <w:proofErr w:type="spellEnd"/>
+      <w:r>
+        <w:t>": "</w:t>
+      </w:r>
+      <w:proofErr w:type="spellStart"/>
+      <w:r>
+        <w:t>SlideGroup</w:t>
+      </w:r>
+      <w:proofErr w:type="spellEnd"/>
+      <w:r>
+        <w:t>",</w:t>
       </w:r>
     </w:p>
     <w:p>
@@ -61,17 +95,41 @@
     </w:p>
     <w:p>
       <w:r>
-        <w:t>  "title": "Nosso Trânsito Multimídia",</w:t>
-      </w:r>
-    </w:p>
-    <w:p>
-      <w:r>
-        <w:t>  "productId": "000001",</w:t>
-      </w:r>
-    </w:p>
-    <w:p>
-      <w:r>
-        <w:t>  "items": [</w:t>
+        <w:t>  "</w:t>
+      </w:r>
+      <w:proofErr w:type="spellStart"/>
+      <w:r>
+        <w:t>title</w:t>
+      </w:r>
+      <w:proofErr w:type="spellEnd"/>
+      <w:r>
+        <w:t>": "Nosso Trânsito Multimídia",</w:t>
+      </w:r>
+    </w:p>
+    <w:p>
+      <w:r>
+        <w:t>  "</w:t>
+      </w:r>
+      <w:proofErr w:type="spellStart"/>
+      <w:r>
+        <w:t>productId</w:t>
+      </w:r>
+      <w:proofErr w:type="spellEnd"/>
+      <w:r>
+        <w:t>": "000001",</w:t>
+      </w:r>
+    </w:p>
+    <w:p>
+      <w:r>
+        <w:t>  "</w:t>
+      </w:r>
+      <w:proofErr w:type="spellStart"/>
+      <w:r>
+        <w:t>items</w:t>
+      </w:r>
+      <w:proofErr w:type="spellEnd"/>
+      <w:r>
+        <w:t>": [</w:t>
       </w:r>
     </w:p>
     <w:p>
@@ -81,7 +139,23 @@
     </w:p>
     <w:p>
       <w:r>
-        <w:t>      "type": "SlideGroup",</w:t>
+        <w:t>      "</w:t>
+      </w:r>
+      <w:proofErr w:type="spellStart"/>
+      <w:r>
+        <w:t>type</w:t>
+      </w:r>
+      <w:proofErr w:type="spellEnd"/>
+      <w:r>
+        <w:t>": "</w:t>
+      </w:r>
+      <w:proofErr w:type="spellStart"/>
+      <w:r>
+        <w:t>SlideGroup</w:t>
+      </w:r>
+      <w:proofErr w:type="spellEnd"/>
+      <w:r>
+        <w:t>",</w:t>
       </w:r>
     </w:p>
     <w:p>
@@ -91,12 +165,28 @@
     </w:p>
     <w:p>
       <w:r>
-        <w:t>      "title": "Legislação de Trânsito",</w:t>
-      </w:r>
-    </w:p>
-    <w:p>
-      <w:r>
-        <w:t>      "items": [</w:t>
+        <w:t>      "</w:t>
+      </w:r>
+      <w:proofErr w:type="spellStart"/>
+      <w:r>
+        <w:t>title</w:t>
+      </w:r>
+      <w:proofErr w:type="spellEnd"/>
+      <w:r>
+        <w:t>": "Legislação de Trânsito",</w:t>
+      </w:r>
+    </w:p>
+    <w:p>
+      <w:r>
+        <w:t>      "</w:t>
+      </w:r>
+      <w:proofErr w:type="spellStart"/>
+      <w:r>
+        <w:t>items</w:t>
+      </w:r>
+      <w:proofErr w:type="spellEnd"/>
+      <w:r>
+        <w:t>": [</w:t>
       </w:r>
     </w:p>
     <w:p>
@@ -106,7 +196,23 @@
     </w:p>
     <w:p>
       <w:r>
-        <w:t>          "type": "SlideGroup",</w:t>
+        <w:t>          "</w:t>
+      </w:r>
+      <w:proofErr w:type="spellStart"/>
+      <w:r>
+        <w:t>type</w:t>
+      </w:r>
+      <w:proofErr w:type="spellEnd"/>
+      <w:r>
+        <w:t>": "</w:t>
+      </w:r>
+      <w:proofErr w:type="spellStart"/>
+      <w:r>
+        <w:t>SlideGroup</w:t>
+      </w:r>
+      <w:proofErr w:type="spellEnd"/>
+      <w:r>
+        <w:t>",</w:t>
       </w:r>
     </w:p>
     <w:p>
@@ -116,12 +222,28 @@
     </w:p>
     <w:p>
       <w:r>
-        <w:t>          "title": "Formação do Condutor",</w:t>
-      </w:r>
-    </w:p>
-    <w:p>
-      <w:r>
-        <w:t>          "items": [</w:t>
+        <w:t>          "</w:t>
+      </w:r>
+      <w:proofErr w:type="spellStart"/>
+      <w:r>
+        <w:t>title</w:t>
+      </w:r>
+      <w:proofErr w:type="spellEnd"/>
+      <w:r>
+        <w:t>": "Formação do Condutor",</w:t>
+      </w:r>
+    </w:p>
+    <w:p>
+      <w:r>
+        <w:t>          "</w:t>
+      </w:r>
+      <w:proofErr w:type="spellStart"/>
+      <w:r>
+        <w:t>items</w:t>
+      </w:r>
+      <w:proofErr w:type="spellEnd"/>
+      <w:r>
+        <w:t>": [</w:t>
       </w:r>
     </w:p>
     <w:p>
@@ -131,7 +253,15 @@
     </w:p>
     <w:p>
       <w:r>
-        <w:t>              "type": "Slide",</w:t>
+        <w:t>              "</w:t>
+      </w:r>
+      <w:proofErr w:type="spellStart"/>
+      <w:r>
+        <w:t>type</w:t>
+      </w:r>
+      <w:proofErr w:type="spellEnd"/>
+      <w:r>
+        <w:t>": "Slide",</w:t>
       </w:r>
     </w:p>
     <w:p>
@@ -141,28 +271,76 @@
     </w:p>
     <w:p>
       <w:r>
-        <w:t>              "bookReference": "4",</w:t>
-      </w:r>
-    </w:p>
-    <w:p>
-      <w:r>
-        <w:t>              "title": "Pré-requisitos Para Habilitação",</w:t>
-      </w:r>
-    </w:p>
-    <w:p>
-      <w:r>
-        <w:t>              "subtitle": null,</w:t>
+        <w:t>              "</w:t>
+      </w:r>
+      <w:proofErr w:type="spellStart"/>
+      <w:r>
+        <w:t>bookReference</w:t>
+      </w:r>
+      <w:proofErr w:type="spellEnd"/>
+      <w:r>
+        <w:t>": "4",</w:t>
+      </w:r>
+    </w:p>
+    <w:p>
+      <w:r>
+        <w:t>              "</w:t>
+      </w:r>
+      <w:proofErr w:type="spellStart"/>
+      <w:r>
+        <w:t>title</w:t>
+      </w:r>
+      <w:proofErr w:type="spellEnd"/>
+      <w:r>
+        <w:t>": "Pré-requisitos Para Habilitação",</w:t>
+      </w:r>
+    </w:p>
+    <w:p>
+      <w:r>
+        <w:t>              "</w:t>
+      </w:r>
+      <w:proofErr w:type="spellStart"/>
+      <w:r>
+        <w:t>subtitle</w:t>
+      </w:r>
+      <w:proofErr w:type="spellEnd"/>
+      <w:r>
+        <w:t xml:space="preserve">": </w:t>
+      </w:r>
+      <w:proofErr w:type="spellStart"/>
+      <w:r>
+        <w:t>null</w:t>
+      </w:r>
+      <w:proofErr w:type="spellEnd"/>
+      <w:r>
+        <w:t>,</w:t>
       </w:r>
     </w:p>
     <w:p>
       <w:r>
         <w:lastRenderedPageBreak/>
-        <w:t>              "audio": "",</w:t>
-      </w:r>
-    </w:p>
-    <w:p>
-      <w:r>
-        <w:t>              "elements": [</w:t>
+        <w:t>              "</w:t>
+      </w:r>
+      <w:proofErr w:type="spellStart"/>
+      <w:r>
+        <w:t>audio</w:t>
+      </w:r>
+      <w:proofErr w:type="spellEnd"/>
+      <w:r>
+        <w:t>": "",</w:t>
+      </w:r>
+    </w:p>
+    <w:p>
+      <w:r>
+        <w:t>              "</w:t>
+      </w:r>
+      <w:proofErr w:type="spellStart"/>
+      <w:r>
+        <w:t>elements</w:t>
+      </w:r>
+      <w:proofErr w:type="spellEnd"/>
+      <w:r>
+        <w:t>": [</w:t>
       </w:r>
     </w:p>
     <w:p>
@@ -172,17 +350,49 @@
     </w:p>
     <w:p>
       <w:r>
-        <w:t>                  "type": "TextElement",</w:t>
-      </w:r>
-    </w:p>
-    <w:p>
-      <w:r>
-        <w:t>                  "styleName": "title1",</w:t>
-      </w:r>
-    </w:p>
-    <w:p>
-      <w:r>
-        <w:t>                  "text": "Pré-requisitos Para"</w:t>
+        <w:t>                  "</w:t>
+      </w:r>
+      <w:proofErr w:type="spellStart"/>
+      <w:r>
+        <w:t>type</w:t>
+      </w:r>
+      <w:proofErr w:type="spellEnd"/>
+      <w:r>
+        <w:t>": "</w:t>
+      </w:r>
+      <w:proofErr w:type="spellStart"/>
+      <w:r>
+        <w:t>TextElement</w:t>
+      </w:r>
+      <w:proofErr w:type="spellEnd"/>
+      <w:r>
+        <w:t>",</w:t>
+      </w:r>
+    </w:p>
+    <w:p>
+      <w:r>
+        <w:t>                  "</w:t>
+      </w:r>
+      <w:proofErr w:type="spellStart"/>
+      <w:r>
+        <w:t>styleName</w:t>
+      </w:r>
+      <w:proofErr w:type="spellEnd"/>
+      <w:r>
+        <w:t>": "title1",</w:t>
+      </w:r>
+    </w:p>
+    <w:p>
+      <w:r>
+        <w:t>                  "</w:t>
+      </w:r>
+      <w:proofErr w:type="spellStart"/>
+      <w:r>
+        <w:t>text</w:t>
+      </w:r>
+      <w:proofErr w:type="spellEnd"/>
+      <w:r>
+        <w:t>": "Pré-requisitos Para"</w:t>
       </w:r>
     </w:p>
     <w:p>
@@ -197,12 +407,36 @@
     </w:p>
     <w:p>
       <w:r>
-        <w:t>                  "type": "GroupElement",</w:t>
-      </w:r>
-    </w:p>
-    <w:p>
-      <w:r>
-        <w:t>                  "elements": [</w:t>
+        <w:t>                  "</w:t>
+      </w:r>
+      <w:proofErr w:type="spellStart"/>
+      <w:r>
+        <w:t>type</w:t>
+      </w:r>
+      <w:proofErr w:type="spellEnd"/>
+      <w:r>
+        <w:t>": "</w:t>
+      </w:r>
+      <w:proofErr w:type="spellStart"/>
+      <w:r>
+        <w:t>GroupElement</w:t>
+      </w:r>
+      <w:proofErr w:type="spellEnd"/>
+      <w:r>
+        <w:t>",</w:t>
+      </w:r>
+    </w:p>
+    <w:p>
+      <w:r>
+        <w:t>                  "</w:t>
+      </w:r>
+      <w:proofErr w:type="spellStart"/>
+      <w:r>
+        <w:t>elements</w:t>
+      </w:r>
+      <w:proofErr w:type="spellEnd"/>
+      <w:r>
+        <w:t>": [</w:t>
       </w:r>
     </w:p>
     <w:p>
@@ -212,17 +446,65 @@
     </w:p>
     <w:p>
       <w:r>
-        <w:t>                      "type": "TextElement",</w:t>
-      </w:r>
-    </w:p>
-    <w:p>
-      <w:r>
-        <w:t>                      "styleName": "paragraph",</w:t>
-      </w:r>
-    </w:p>
-    <w:p>
-      <w:r>
-        <w:t>                      "text": "Exemplo de texto dentro de um GroupElement."</w:t>
+        <w:t>                      "</w:t>
+      </w:r>
+      <w:proofErr w:type="spellStart"/>
+      <w:r>
+        <w:t>type</w:t>
+      </w:r>
+      <w:proofErr w:type="spellEnd"/>
+      <w:r>
+        <w:t>": "</w:t>
+      </w:r>
+      <w:proofErr w:type="spellStart"/>
+      <w:r>
+        <w:t>TextElement</w:t>
+      </w:r>
+      <w:proofErr w:type="spellEnd"/>
+      <w:r>
+        <w:t>",</w:t>
+      </w:r>
+    </w:p>
+    <w:p>
+      <w:r>
+        <w:t>                      "</w:t>
+      </w:r>
+      <w:proofErr w:type="spellStart"/>
+      <w:r>
+        <w:t>styleName</w:t>
+      </w:r>
+      <w:proofErr w:type="spellEnd"/>
+      <w:r>
+        <w:t>": "</w:t>
+      </w:r>
+      <w:proofErr w:type="spellStart"/>
+      <w:r>
+        <w:t>paragraph</w:t>
+      </w:r>
+      <w:proofErr w:type="spellEnd"/>
+      <w:r>
+        <w:t>",</w:t>
+      </w:r>
+    </w:p>
+    <w:p>
+      <w:r>
+        <w:t>                      "</w:t>
+      </w:r>
+      <w:proofErr w:type="spellStart"/>
+      <w:r>
+        <w:t>text</w:t>
+      </w:r>
+      <w:proofErr w:type="spellEnd"/>
+      <w:r>
+        <w:t xml:space="preserve">": "Exemplo de texto dentro de um </w:t>
+      </w:r>
+      <w:proofErr w:type="spellStart"/>
+      <w:r>
+        <w:t>GroupElement</w:t>
+      </w:r>
+      <w:proofErr w:type="spellEnd"/>
+      <w:r>
+        <w:t>."</w:t>
       </w:r>
     </w:p>
     <w:p>
@@ -237,37 +519,125 @@
     </w:p>
     <w:p>
       <w:r>
-        <w:t>                      "type": "ImageElement",</w:t>
-      </w:r>
-    </w:p>
-    <w:p>
-      <w:r>
-        <w:t>                      "title": "Ilustração",</w:t>
-      </w:r>
-    </w:p>
-    <w:p>
-      <w:r>
-        <w:t>                      "legend": "",</w:t>
-      </w:r>
-    </w:p>
-    <w:p>
-      <w:r>
-        <w:t>                      "source": "exames para habilitação.swf",</w:t>
-      </w:r>
-    </w:p>
-    <w:p>
-      <w:r>
-        <w:t>                      "width": 0,</w:t>
-      </w:r>
-    </w:p>
-    <w:p>
-      <w:r>
-        <w:t>                      "height": 0,</w:t>
-      </w:r>
-    </w:p>
-    <w:p>
-      <w:r>
-        <w:t>                      "searchText": "avaliação psicológica\nexame de aptidão física e mental\nexame direção veicular\nexame teórico-técnico"</w:t>
+        <w:t>                      "</w:t>
+      </w:r>
+      <w:proofErr w:type="spellStart"/>
+      <w:r>
+        <w:t>type</w:t>
+      </w:r>
+      <w:proofErr w:type="spellEnd"/>
+      <w:r>
+        <w:t>": "</w:t>
+      </w:r>
+      <w:proofErr w:type="spellStart"/>
+      <w:r>
+        <w:t>ImageElement</w:t>
+      </w:r>
+      <w:proofErr w:type="spellEnd"/>
+      <w:r>
+        <w:t>",</w:t>
+      </w:r>
+    </w:p>
+    <w:p>
+      <w:r>
+        <w:t>                      "</w:t>
+      </w:r>
+      <w:proofErr w:type="spellStart"/>
+      <w:r>
+        <w:t>title</w:t>
+      </w:r>
+      <w:proofErr w:type="spellEnd"/>
+      <w:r>
+        <w:t>": "Ilustração",</w:t>
+      </w:r>
+    </w:p>
+    <w:p>
+      <w:r>
+        <w:t>                      "</w:t>
+      </w:r>
+      <w:proofErr w:type="spellStart"/>
+      <w:r>
+        <w:t>legend</w:t>
+      </w:r>
+      <w:proofErr w:type="spellEnd"/>
+      <w:r>
+        <w:t>": "",</w:t>
+      </w:r>
+    </w:p>
+    <w:p>
+      <w:r>
+        <w:t>                      "</w:t>
+      </w:r>
+      <w:proofErr w:type="spellStart"/>
+      <w:r>
+        <w:t>source</w:t>
+      </w:r>
+      <w:proofErr w:type="spellEnd"/>
+      <w:r>
+        <w:t>": "exames para habilitação.swf",</w:t>
+      </w:r>
+    </w:p>
+    <w:p>
+      <w:r>
+        <w:t>                      "</w:t>
+      </w:r>
+      <w:proofErr w:type="spellStart"/>
+      <w:r>
+        <w:t>width</w:t>
+      </w:r>
+      <w:proofErr w:type="spellEnd"/>
+      <w:r>
+        <w:t>": 0,</w:t>
+      </w:r>
+    </w:p>
+    <w:p>
+      <w:r>
+        <w:t>                      "</w:t>
+      </w:r>
+      <w:proofErr w:type="spellStart"/>
+      <w:r>
+        <w:t>height</w:t>
+      </w:r>
+      <w:proofErr w:type="spellEnd"/>
+      <w:r>
+        <w:t>": 0,</w:t>
+      </w:r>
+    </w:p>
+    <w:p>
+      <w:r>
+        <w:t>                      "</w:t>
+      </w:r>
+      <w:proofErr w:type="spellStart"/>
+      <w:r>
+        <w:t>searchText</w:t>
+      </w:r>
+      <w:proofErr w:type="spellEnd"/>
+      <w:r>
+        <w:t>": "avaliação psicológica\</w:t>
+      </w:r>
+      <w:proofErr w:type="spellStart"/>
+      <w:r>
+        <w:t>nexame</w:t>
+      </w:r>
+      <w:proofErr w:type="spellEnd"/>
+      <w:r>
+        <w:t xml:space="preserve"> de aptidão física e mental\</w:t>
+      </w:r>
+      <w:proofErr w:type="spellStart"/>
+      <w:r>
+        <w:t>nexame</w:t>
+      </w:r>
+      <w:proofErr w:type="spellEnd"/>
+      <w:r>
+        <w:t xml:space="preserve"> direção veicular\</w:t>
+      </w:r>
+      <w:proofErr w:type="spellStart"/>
+      <w:r>
+        <w:t>nexame</w:t>
+      </w:r>
+      <w:proofErr w:type="spellEnd"/>
+      <w:r>
+        <w:t xml:space="preserve"> teórico-técnico"</w:t>
       </w:r>
     </w:p>
     <w:p>
@@ -282,23 +652,79 @@
     </w:p>
     <w:p>
       <w:r>
-        <w:t>                  "verticalAlign": "middle",</w:t>
-      </w:r>
-    </w:p>
-    <w:p>
-      <w:r>
-        <w:t>                  "mode": "horizontalGroup",</w:t>
+        <w:t>                  "</w:t>
+      </w:r>
+      <w:proofErr w:type="spellStart"/>
+      <w:r>
+        <w:t>verticalAlign</w:t>
+      </w:r>
+      <w:proofErr w:type="spellEnd"/>
+      <w:r>
+        <w:t>": "</w:t>
+      </w:r>
+      <w:proofErr w:type="spellStart"/>
+      <w:r>
+        <w:t>middle</w:t>
+      </w:r>
+      <w:proofErr w:type="spellEnd"/>
+      <w:r>
+        <w:t>",</w:t>
+      </w:r>
+    </w:p>
+    <w:p>
+      <w:r>
+        <w:t>                  "</w:t>
+      </w:r>
+      <w:proofErr w:type="spellStart"/>
+      <w:r>
+        <w:t>mode</w:t>
+      </w:r>
+      <w:proofErr w:type="spellEnd"/>
+      <w:r>
+        <w:t>": "</w:t>
+      </w:r>
+      <w:proofErr w:type="spellStart"/>
+      <w:r>
+        <w:t>horizontalGroup</w:t>
+      </w:r>
+      <w:proofErr w:type="spellEnd"/>
+      <w:r>
+        <w:t>",</w:t>
       </w:r>
     </w:p>
     <w:p>
       <w:r>
         <w:lastRenderedPageBreak/>
-        <w:t>                  "horizontalAlign": "left",</w:t>
-      </w:r>
-    </w:p>
-    <w:p>
-      <w:r>
-        <w:t>                  "fillHeight": false</w:t>
+        <w:t>                  "</w:t>
+      </w:r>
+      <w:proofErr w:type="spellStart"/>
+      <w:r>
+        <w:t>horizontalAlign</w:t>
+      </w:r>
+      <w:proofErr w:type="spellEnd"/>
+      <w:r>
+        <w:t>": "</w:t>
+      </w:r>
+      <w:proofErr w:type="spellStart"/>
+      <w:r>
+        <w:t>left</w:t>
+      </w:r>
+      <w:proofErr w:type="spellEnd"/>
+      <w:r>
+        <w:t>",</w:t>
+      </w:r>
+    </w:p>
+    <w:p>
+      <w:r>
+        <w:t>                  "</w:t>
+      </w:r>
+      <w:proofErr w:type="spellStart"/>
+      <w:r>
+        <w:t>fillHeight</w:t>
+      </w:r>
+      <w:proofErr w:type="spellEnd"/>
+      <w:r>
+        <w:t>": false</w:t>
       </w:r>
     </w:p>
     <w:p>
@@ -313,22 +739,109 @@
     </w:p>
     <w:p>
       <w:r>
-        <w:t>                  "type": "ListElement",</w:t>
-      </w:r>
-    </w:p>
-    <w:p>
-      <w:r>
-        <w:t>                  "styleName": "unorderedList",</w:t>
-      </w:r>
-    </w:p>
-    <w:p>
-      <w:r>
-        <w:t>                  "text": "Ser penalmente imputável (que possa ser processado na forma da Lei);\nSaber ler e escrever;\nPossuir documento de identidade;\nPossuir Cadastro de Pessoa Física - CPF.\n",</w:t>
-      </w:r>
-    </w:p>
-    <w:p>
-      <w:r>
-        <w:t>                  "startIndex": 1</w:t>
+        <w:t>                  "</w:t>
+      </w:r>
+      <w:proofErr w:type="spellStart"/>
+      <w:r>
+        <w:t>type</w:t>
+      </w:r>
+      <w:proofErr w:type="spellEnd"/>
+      <w:r>
+        <w:t>": "</w:t>
+      </w:r>
+      <w:proofErr w:type="spellStart"/>
+      <w:r>
+        <w:t>ListElement</w:t>
+      </w:r>
+      <w:proofErr w:type="spellEnd"/>
+      <w:r>
+        <w:t>",</w:t>
+      </w:r>
+    </w:p>
+    <w:p>
+      <w:r>
+        <w:t>                  "</w:t>
+      </w:r>
+      <w:proofErr w:type="spellStart"/>
+      <w:r>
+        <w:t>styleName</w:t>
+      </w:r>
+      <w:proofErr w:type="spellEnd"/>
+      <w:r>
+        <w:t>": "</w:t>
+      </w:r>
+      <w:proofErr w:type="spellStart"/>
+      <w:r>
+        <w:t>unorderedList</w:t>
+      </w:r>
+      <w:proofErr w:type="spellEnd"/>
+      <w:r>
+        <w:t>",</w:t>
+      </w:r>
+    </w:p>
+    <w:p>
+      <w:r>
+        <w:t>                  "</w:t>
+      </w:r>
+      <w:proofErr w:type="spellStart"/>
+      <w:r>
+        <w:t>text</w:t>
+      </w:r>
+      <w:proofErr w:type="spellEnd"/>
+      <w:r>
+        <w:t>": "Ser penalmente imputável (que possa ser processado na forma da Lei</w:t>
+      </w:r>
+      <w:proofErr w:type="gramStart"/>
+      <w:r>
+        <w:t>);\</w:t>
+      </w:r>
+      <w:proofErr w:type="spellStart"/>
+      <w:proofErr w:type="gramEnd"/>
+      <w:r>
+        <w:t>nSaber</w:t>
+      </w:r>
+      <w:proofErr w:type="spellEnd"/>
+      <w:r>
+        <w:t xml:space="preserve"> ler e </w:t>
+      </w:r>
+      <w:proofErr w:type="gramStart"/>
+      <w:r>
+        <w:t>escrever;\</w:t>
+      </w:r>
+      <w:proofErr w:type="spellStart"/>
+      <w:proofErr w:type="gramEnd"/>
+      <w:r>
+        <w:t>nPossuir</w:t>
+      </w:r>
+      <w:proofErr w:type="spellEnd"/>
+      <w:r>
+        <w:t xml:space="preserve"> documento de </w:t>
+      </w:r>
+      <w:proofErr w:type="gramStart"/>
+      <w:r>
+        <w:t>identidade;\</w:t>
+      </w:r>
+      <w:proofErr w:type="spellStart"/>
+      <w:proofErr w:type="gramEnd"/>
+      <w:r>
+        <w:t>nPossuir</w:t>
+      </w:r>
+      <w:proofErr w:type="spellEnd"/>
+      <w:r>
+        <w:t xml:space="preserve"> Cadastro de Pessoa Física - CPF.\n",</w:t>
+      </w:r>
+    </w:p>
+    <w:p>
+      <w:r>
+        <w:t>                  "</w:t>
+      </w:r>
+      <w:proofErr w:type="spellStart"/>
+      <w:r>
+        <w:t>startIndex</w:t>
+      </w:r>
+      <w:proofErr w:type="spellEnd"/>
+      <w:r>
+        <w:t>": 1</w:t>
       </w:r>
     </w:p>
     <w:p>
@@ -343,22 +856,104 @@
     </w:p>
     <w:p>
       <w:r>
-        <w:t>                  "type": "ListElement",</w:t>
-      </w:r>
-    </w:p>
-    <w:p>
-      <w:r>
-        <w:t>                  "styleName": "numberList",</w:t>
-      </w:r>
-    </w:p>
-    <w:p>
-      <w:r>
-        <w:t>                  "text": "Primeiro passo;\nSegundo passo;\nTerceiro passo;\n",</w:t>
-      </w:r>
-    </w:p>
-    <w:p>
-      <w:r>
-        <w:t>                  "startIndex": 1</w:t>
+        <w:t>                  "</w:t>
+      </w:r>
+      <w:proofErr w:type="spellStart"/>
+      <w:r>
+        <w:t>type</w:t>
+      </w:r>
+      <w:proofErr w:type="spellEnd"/>
+      <w:r>
+        <w:t>": "</w:t>
+      </w:r>
+      <w:proofErr w:type="spellStart"/>
+      <w:r>
+        <w:t>ListElement</w:t>
+      </w:r>
+      <w:proofErr w:type="spellEnd"/>
+      <w:r>
+        <w:t>",</w:t>
+      </w:r>
+    </w:p>
+    <w:p>
+      <w:r>
+        <w:t>                  "</w:t>
+      </w:r>
+      <w:proofErr w:type="spellStart"/>
+      <w:r>
+        <w:t>styleName</w:t>
+      </w:r>
+      <w:proofErr w:type="spellEnd"/>
+      <w:r>
+        <w:t>": "</w:t>
+      </w:r>
+      <w:proofErr w:type="spellStart"/>
+      <w:r>
+        <w:t>numberList</w:t>
+      </w:r>
+      <w:proofErr w:type="spellEnd"/>
+      <w:r>
+        <w:t>",</w:t>
+      </w:r>
+    </w:p>
+    <w:p>
+      <w:r>
+        <w:t>                  "</w:t>
+      </w:r>
+      <w:proofErr w:type="spellStart"/>
+      <w:r>
+        <w:t>text</w:t>
+      </w:r>
+      <w:proofErr w:type="spellEnd"/>
+      <w:r>
+        <w:t xml:space="preserve">": "Primeiro </w:t>
+      </w:r>
+      <w:proofErr w:type="gramStart"/>
+      <w:r>
+        <w:t>passo;\</w:t>
+      </w:r>
+      <w:proofErr w:type="spellStart"/>
+      <w:proofErr w:type="gramEnd"/>
+      <w:r>
+        <w:t>nSegundo</w:t>
+      </w:r>
+      <w:proofErr w:type="spellEnd"/>
+      <w:r>
+        <w:t xml:space="preserve"> </w:t>
+      </w:r>
+      <w:proofErr w:type="gramStart"/>
+      <w:r>
+        <w:t>passo;\</w:t>
+      </w:r>
+      <w:proofErr w:type="spellStart"/>
+      <w:proofErr w:type="gramEnd"/>
+      <w:r>
+        <w:t>nTerceiro</w:t>
+      </w:r>
+      <w:proofErr w:type="spellEnd"/>
+      <w:r>
+        <w:t xml:space="preserve"> </w:t>
+      </w:r>
+      <w:proofErr w:type="gramStart"/>
+      <w:r>
+        <w:t>passo;\</w:t>
+      </w:r>
+      <w:proofErr w:type="gramEnd"/>
+      <w:r>
+        <w:t>n",</w:t>
+      </w:r>
+    </w:p>
+    <w:p>
+      <w:r>
+        <w:t>                  "</w:t>
+      </w:r>
+      <w:proofErr w:type="spellStart"/>
+      <w:r>
+        <w:t>startIndex</w:t>
+      </w:r>
+      <w:proofErr w:type="spellEnd"/>
+      <w:r>
+        <w:t>": 1</w:t>
       </w:r>
     </w:p>
     <w:p>
@@ -373,17 +968,49 @@
     </w:p>
     <w:p>
       <w:r>
-        <w:t>                  "type": "InfoBoxElement",</w:t>
-      </w:r>
-    </w:p>
-    <w:p>
-      <w:r>
-        <w:t>                  "title": "Info",</w:t>
-      </w:r>
-    </w:p>
-    <w:p>
-      <w:r>
-        <w:t>                  "elements": [</w:t>
+        <w:t>                  "</w:t>
+      </w:r>
+      <w:proofErr w:type="spellStart"/>
+      <w:r>
+        <w:t>type</w:t>
+      </w:r>
+      <w:proofErr w:type="spellEnd"/>
+      <w:r>
+        <w:t>": "</w:t>
+      </w:r>
+      <w:proofErr w:type="spellStart"/>
+      <w:r>
+        <w:t>InfoBoxElement</w:t>
+      </w:r>
+      <w:proofErr w:type="spellEnd"/>
+      <w:r>
+        <w:t>",</w:t>
+      </w:r>
+    </w:p>
+    <w:p>
+      <w:r>
+        <w:t>                  "</w:t>
+      </w:r>
+      <w:proofErr w:type="spellStart"/>
+      <w:r>
+        <w:t>title</w:t>
+      </w:r>
+      <w:proofErr w:type="spellEnd"/>
+      <w:r>
+        <w:t>": "Info",</w:t>
+      </w:r>
+    </w:p>
+    <w:p>
+      <w:r>
+        <w:t>                  "</w:t>
+      </w:r>
+      <w:proofErr w:type="spellStart"/>
+      <w:r>
+        <w:t>elements</w:t>
+      </w:r>
+      <w:proofErr w:type="spellEnd"/>
+      <w:r>
+        <w:t>": [</w:t>
       </w:r>
     </w:p>
     <w:p>
@@ -393,17 +1020,57 @@
     </w:p>
     <w:p>
       <w:r>
-        <w:t>                      "type": "TextElement",</w:t>
-      </w:r>
-    </w:p>
-    <w:p>
-      <w:r>
-        <w:t>                      "styleName": "paragraph",</w:t>
-      </w:r>
-    </w:p>
-    <w:p>
-      <w:r>
-        <w:t>                      "text": "Você não poderá se habilitar ou se reabilitar se estiver respondendo por um delito de trânsito ou com sua habilitação suspensa ou cassada."</w:t>
+        <w:t>                      "</w:t>
+      </w:r>
+      <w:proofErr w:type="spellStart"/>
+      <w:r>
+        <w:t>type</w:t>
+      </w:r>
+      <w:proofErr w:type="spellEnd"/>
+      <w:r>
+        <w:t>": "</w:t>
+      </w:r>
+      <w:proofErr w:type="spellStart"/>
+      <w:r>
+        <w:t>TextElement</w:t>
+      </w:r>
+      <w:proofErr w:type="spellEnd"/>
+      <w:r>
+        <w:t>",</w:t>
+      </w:r>
+    </w:p>
+    <w:p>
+      <w:r>
+        <w:t>                      "</w:t>
+      </w:r>
+      <w:proofErr w:type="spellStart"/>
+      <w:r>
+        <w:t>styleName</w:t>
+      </w:r>
+      <w:proofErr w:type="spellEnd"/>
+      <w:r>
+        <w:t>": "</w:t>
+      </w:r>
+      <w:proofErr w:type="spellStart"/>
+      <w:r>
+        <w:t>paragraph</w:t>
+      </w:r>
+      <w:proofErr w:type="spellEnd"/>
+      <w:r>
+        <w:t>",</w:t>
+      </w:r>
+    </w:p>
+    <w:p>
+      <w:r>
+        <w:t>                      "</w:t>
+      </w:r>
+      <w:proofErr w:type="spellStart"/>
+      <w:r>
+        <w:t>text</w:t>
+      </w:r>
+      <w:proofErr w:type="spellEnd"/>
+      <w:r>
+        <w:t>": "Você não poderá se habilitar ou se reabilitar se estiver respondendo por um delito de trânsito ou com sua habilitação suspensa ou cassada."</w:t>
       </w:r>
     </w:p>
     <w:p>
@@ -418,23 +1085,71 @@
     </w:p>
     <w:p>
       <w:r>
-        <w:t>                  "verticalAlign": "top",</w:t>
+        <w:t>                  "</w:t>
+      </w:r>
+      <w:proofErr w:type="spellStart"/>
+      <w:r>
+        <w:t>verticalAlign</w:t>
+      </w:r>
+      <w:proofErr w:type="spellEnd"/>
+      <w:r>
+        <w:t>": "top",</w:t>
       </w:r>
     </w:p>
     <w:p>
       <w:r>
         <w:lastRenderedPageBreak/>
-        <w:t>                  "mode": "verticalGroup",</w:t>
-      </w:r>
-    </w:p>
-    <w:p>
-      <w:r>
-        <w:t>                  "horizontalAlign": "left",</w:t>
-      </w:r>
-    </w:p>
-    <w:p>
-      <w:r>
-        <w:t>                  "fillHeight": false,</w:t>
+        <w:t>                  "</w:t>
+      </w:r>
+      <w:proofErr w:type="spellStart"/>
+      <w:r>
+        <w:t>mode</w:t>
+      </w:r>
+      <w:proofErr w:type="spellEnd"/>
+      <w:r>
+        <w:t>": "</w:t>
+      </w:r>
+      <w:proofErr w:type="spellStart"/>
+      <w:r>
+        <w:t>verticalGroup</w:t>
+      </w:r>
+      <w:proofErr w:type="spellEnd"/>
+      <w:r>
+        <w:t>",</w:t>
+      </w:r>
+    </w:p>
+    <w:p>
+      <w:r>
+        <w:t>                  "</w:t>
+      </w:r>
+      <w:proofErr w:type="spellStart"/>
+      <w:r>
+        <w:t>horizontalAlign</w:t>
+      </w:r>
+      <w:proofErr w:type="spellEnd"/>
+      <w:r>
+        <w:t>": "</w:t>
+      </w:r>
+      <w:proofErr w:type="spellStart"/>
+      <w:r>
+        <w:t>left</w:t>
+      </w:r>
+      <w:proofErr w:type="spellEnd"/>
+      <w:r>
+        <w:t>",</w:t>
+      </w:r>
+    </w:p>
+    <w:p>
+      <w:r>
+        <w:t>                  "</w:t>
+      </w:r>
+      <w:proofErr w:type="spellStart"/>
+      <w:r>
+        <w:t>fillHeight</w:t>
+      </w:r>
+      <w:proofErr w:type="spellEnd"/>
+      <w:r>
+        <w:t>": false,</w:t>
       </w:r>
     </w:p>
     <w:p>
@@ -459,32 +1174,96 @@
     </w:p>
     <w:p>
       <w:r>
-        <w:t>                  "type": "GridElement",</w:t>
-      </w:r>
-    </w:p>
-    <w:p>
-      <w:r>
-        <w:t>                  "alternateRowColor": true,</w:t>
-      </w:r>
-    </w:p>
-    <w:p>
-      <w:r>
-        <w:t>                  "columnNumber": 3,</w:t>
-      </w:r>
-    </w:p>
-    <w:p>
-      <w:r>
-        <w:t>                  "featureColumn": 1,</w:t>
-      </w:r>
-    </w:p>
-    <w:p>
-      <w:r>
-        <w:t>                  "columnSizes": [2.5, 2.5, 2.5],</w:t>
-      </w:r>
-    </w:p>
-    <w:p>
-      <w:r>
-        <w:t>                  "content": [</w:t>
+        <w:t>                  "</w:t>
+      </w:r>
+      <w:proofErr w:type="spellStart"/>
+      <w:r>
+        <w:t>type</w:t>
+      </w:r>
+      <w:proofErr w:type="spellEnd"/>
+      <w:r>
+        <w:t>": "</w:t>
+      </w:r>
+      <w:proofErr w:type="spellStart"/>
+      <w:r>
+        <w:t>GridElement</w:t>
+      </w:r>
+      <w:proofErr w:type="spellEnd"/>
+      <w:r>
+        <w:t>",</w:t>
+      </w:r>
+    </w:p>
+    <w:p>
+      <w:r>
+        <w:t>                  "</w:t>
+      </w:r>
+      <w:proofErr w:type="spellStart"/>
+      <w:r>
+        <w:t>alternateRowColor</w:t>
+      </w:r>
+      <w:proofErr w:type="spellEnd"/>
+      <w:r>
+        <w:t xml:space="preserve">": </w:t>
+      </w:r>
+      <w:proofErr w:type="spellStart"/>
+      <w:r>
+        <w:t>true</w:t>
+      </w:r>
+      <w:proofErr w:type="spellEnd"/>
+      <w:r>
+        <w:t>,</w:t>
+      </w:r>
+    </w:p>
+    <w:p>
+      <w:r>
+        <w:t>                  "</w:t>
+      </w:r>
+      <w:proofErr w:type="spellStart"/>
+      <w:r>
+        <w:t>columnNumber</w:t>
+      </w:r>
+      <w:proofErr w:type="spellEnd"/>
+      <w:r>
+        <w:t>": 3,</w:t>
+      </w:r>
+    </w:p>
+    <w:p>
+      <w:r>
+        <w:t>                  "</w:t>
+      </w:r>
+      <w:proofErr w:type="spellStart"/>
+      <w:r>
+        <w:t>featureColumn</w:t>
+      </w:r>
+      <w:proofErr w:type="spellEnd"/>
+      <w:r>
+        <w:t>": 1,</w:t>
+      </w:r>
+    </w:p>
+    <w:p>
+      <w:r>
+        <w:t>                  "</w:t>
+      </w:r>
+      <w:proofErr w:type="spellStart"/>
+      <w:r>
+        <w:t>columnSizes</w:t>
+      </w:r>
+      <w:proofErr w:type="spellEnd"/>
+      <w:r>
+        <w:t>": [2.5, 2.5, 2.5],</w:t>
+      </w:r>
+    </w:p>
+    <w:p>
+      <w:r>
+        <w:t>                  "</w:t>
+      </w:r>
+      <w:proofErr w:type="spellStart"/>
+      <w:r>
+        <w:t>content</w:t>
+      </w:r>
+      <w:proofErr w:type="spellEnd"/>
+      <w:r>
+        <w:t>": [</w:t>
       </w:r>
     </w:p>
     <w:p>
@@ -504,7 +1283,15 @@
     </w:p>
     <w:p>
       <w:r>
-        <w:t>                    ["Adição Cat A", "---", "15 h."],</w:t>
+        <w:t xml:space="preserve">                    ["Adição </w:t>
+      </w:r>
+      <w:proofErr w:type="spellStart"/>
+      <w:r>
+        <w:t>Cat</w:t>
+      </w:r>
+      <w:proofErr w:type="spellEnd"/>
+      <w:r>
+        <w:t xml:space="preserve"> A", "---", "15 h."],</w:t>
       </w:r>
     </w:p>
     <w:p>
@@ -514,7 +1301,15 @@
     </w:p>
     <w:p>
       <w:r>
-        <w:t>                    ["Adição Cat B", "---", "15 h."]</w:t>
+        <w:t xml:space="preserve">                    ["Adição </w:t>
+      </w:r>
+      <w:proofErr w:type="spellStart"/>
+      <w:r>
+        <w:t>Cat</w:t>
+      </w:r>
+      <w:proofErr w:type="spellEnd"/>
+      <w:r>
+        <w:t xml:space="preserve"> B", "---", "15 h."]</w:t>
       </w:r>
     </w:p>
     <w:p>
@@ -524,8 +1319,21 @@
     </w:p>
     <w:p>
       <w:r>
-        <w:t>                  "isFirstRowHeader": true</w:t>
-      </w:r>
+        <w:t>                  "</w:t>
+      </w:r>
+      <w:proofErr w:type="spellStart"/>
+      <w:r>
+        <w:t>isFirstRowHeader</w:t>
+      </w:r>
+      <w:proofErr w:type="spellEnd"/>
+      <w:r>
+        <w:t xml:space="preserve">": </w:t>
+      </w:r>
+      <w:proofErr w:type="spellStart"/>
+      <w:r>
+        <w:t>true</w:t>
+      </w:r>
+      <w:proofErr w:type="spellEnd"/>
     </w:p>
     <w:p>
       <w:r>
@@ -539,22 +1347,70 @@
     </w:p>
     <w:p>
       <w:r>
-        <w:t>                  "type": "VideoElement",</w:t>
-      </w:r>
-    </w:p>
-    <w:p>
-      <w:r>
-        <w:t>                  "title": "Vídeo",</w:t>
-      </w:r>
-    </w:p>
-    <w:p>
-      <w:r>
-        <w:t>                  "previewImage": "direcao-defensiva-condicoes-do-condutor-via-usuario.jpg",</w:t>
-      </w:r>
-    </w:p>
-    <w:p>
-      <w:r>
-        <w:t>                  "video": "https://www.youtube.com/watch?v=VIDEO_ID"</w:t>
+        <w:t>                  "</w:t>
+      </w:r>
+      <w:proofErr w:type="spellStart"/>
+      <w:r>
+        <w:t>type</w:t>
+      </w:r>
+      <w:proofErr w:type="spellEnd"/>
+      <w:r>
+        <w:t>": "</w:t>
+      </w:r>
+      <w:proofErr w:type="spellStart"/>
+      <w:r>
+        <w:t>VideoElement</w:t>
+      </w:r>
+      <w:proofErr w:type="spellEnd"/>
+      <w:r>
+        <w:t>",</w:t>
+      </w:r>
+    </w:p>
+    <w:p>
+      <w:r>
+        <w:t>                  "</w:t>
+      </w:r>
+      <w:proofErr w:type="spellStart"/>
+      <w:r>
+        <w:t>title</w:t>
+      </w:r>
+      <w:proofErr w:type="spellEnd"/>
+      <w:r>
+        <w:t>": "Vídeo",</w:t>
+      </w:r>
+    </w:p>
+    <w:p>
+      <w:r>
+        <w:t>                  "</w:t>
+      </w:r>
+      <w:proofErr w:type="spellStart"/>
+      <w:r>
+        <w:t>previewImage</w:t>
+      </w:r>
+      <w:proofErr w:type="spellEnd"/>
+      <w:r>
+        <w:t>": "direcao-defensiva-condicoes-do-condutor-via-usuario.jpg",</w:t>
+      </w:r>
+    </w:p>
+    <w:p>
+      <w:r>
+        <w:t>                  "</w:t>
+      </w:r>
+      <w:proofErr w:type="spellStart"/>
+      <w:r>
+        <w:t>video</w:t>
+      </w:r>
+      <w:proofErr w:type="spellEnd"/>
+      <w:r>
+        <w:t>": "https://www.youtube.com/</w:t>
+      </w:r>
+      <w:proofErr w:type="spellStart"/>
+      <w:r>
+        <w:t>watch?v</w:t>
+      </w:r>
+      <w:proofErr w:type="spellEnd"/>
+      <w:r>
+        <w:t>=VIDEO_ID"</w:t>
       </w:r>
     </w:p>
     <w:p>
@@ -570,7 +1426,23 @@
     </w:p>
     <w:p>
       <w:r>
-        <w:t>                  "type": "AppLauncherElement",</w:t>
+        <w:t>                  "</w:t>
+      </w:r>
+      <w:proofErr w:type="spellStart"/>
+      <w:r>
+        <w:t>type</w:t>
+      </w:r>
+      <w:proofErr w:type="spellEnd"/>
+      <w:r>
+        <w:t>": "</w:t>
+      </w:r>
+      <w:proofErr w:type="spellStart"/>
+      <w:r>
+        <w:t>AppLauncherElement</w:t>
+      </w:r>
+      <w:proofErr w:type="spellEnd"/>
+      <w:r>
+        <w:t>",</w:t>
       </w:r>
     </w:p>
     <w:p>
@@ -776,6 +1648,8 @@
         </w:rPr>
         <w:t xml:space="preserve">Este é o </w:t>
       </w:r>
+      <w:proofErr w:type="spellStart"/>
+      <w:proofErr w:type="gramStart"/>
       <w:r>
         <w:rPr>
           <w:b/>
@@ -784,7 +1658,19 @@
           <w:sz w:val="52"/>
           <w:szCs w:val="52"/>
         </w:rPr>
-        <w:t>data.json completo</w:t>
+        <w:t>data.json</w:t>
+      </w:r>
+      <w:proofErr w:type="spellEnd"/>
+      <w:proofErr w:type="gramEnd"/>
+      <w:r>
+        <w:rPr>
+          <w:b/>
+          <w:bCs/>
+          <w:color w:val="EE0000"/>
+          <w:sz w:val="52"/>
+          <w:szCs w:val="52"/>
+        </w:rPr>
+        <w:t xml:space="preserve"> completo</w:t>
       </w:r>
       <w:r>
         <w:rPr>
@@ -831,13 +1717,22 @@
           <w:rStyle w:val="Hyperlink"/>
           <w:u w:val="none"/>
         </w:rPr>
-        <w:t xml:space="preserve"> com seus respectivos css</w:t>
-      </w:r>
+        <w:t xml:space="preserve"> com seus respectivos </w:t>
+      </w:r>
+      <w:proofErr w:type="spellStart"/>
       <w:r>
         <w:rPr>
           <w:rStyle w:val="Hyperlink"/>
           <w:u w:val="none"/>
         </w:rPr>
+        <w:t>css</w:t>
+      </w:r>
+      <w:proofErr w:type="spellEnd"/>
+      <w:r>
+        <w:rPr>
+          <w:rStyle w:val="Hyperlink"/>
+          <w:u w:val="none"/>
+        </w:rPr>
         <w:t>:</w:t>
       </w:r>
     </w:p>
@@ -856,6 +1751,7 @@
         <w:lastRenderedPageBreak/>
         <w:t xml:space="preserve">Tipo </w:t>
       </w:r>
+      <w:proofErr w:type="spellStart"/>
       <w:r>
         <w:rPr>
           <w:b/>
@@ -863,6 +1759,7 @@
         </w:rPr>
         <w:t>TextElement</w:t>
       </w:r>
+      <w:proofErr w:type="spellEnd"/>
       <w:r>
         <w:rPr>
           <w:b/>
@@ -893,12 +1790,6 @@
       </w:r>
     </w:p>
     <w:p>
-      <w:pPr>
-        <w:rPr>
-          <w:rStyle w:val="Hyperlink"/>
-          <w:u w:val="none"/>
-        </w:rPr>
-      </w:pPr>
       <w:hyperlink r:id="rId8" w:history="1">
         <w:r>
           <w:rPr>
@@ -915,35 +1806,14 @@
           <w:u w:val="none"/>
         </w:rPr>
       </w:pPr>
-    </w:p>
-    <w:p>
-      <w:pPr>
-        <w:rPr>
-          <w:b/>
-          <w:bCs/>
-        </w:rPr>
-      </w:pPr>
-      <w:r>
-        <w:rPr>
-          <w:b/>
-          <w:bCs/>
-        </w:rPr>
-        <w:t>ListElement: Uma lista com marcadores ou numerada</w:t>
-      </w:r>
-      <w:r>
-        <w:rPr>
-          <w:b/>
-          <w:bCs/>
-        </w:rPr>
-        <w:t xml:space="preserve"> - </w:t>
-      </w:r>
-      <w:r>
-        <w:rPr>
-          <w:b/>
-          <w:bCs/>
-        </w:rPr>
-        <w:t>list-element.js</w:t>
-      </w:r>
+      <w:hyperlink r:id="rId9" w:history="1">
+        <w:r>
+          <w:rPr>
+            <w:rStyle w:val="Hyperlink"/>
+          </w:rPr>
+          <w:t>https://raw.githubusercontent.com/AlexBrazil/Multimidia_Web/refs/heads/main/css/elements/text-element.css</w:t>
+        </w:r>
+      </w:hyperlink>
     </w:p>
     <w:p>
       <w:pPr>
@@ -952,7 +1822,47 @@
           <w:u w:val="none"/>
         </w:rPr>
       </w:pPr>
-      <w:hyperlink r:id="rId9" w:history="1">
+    </w:p>
+    <w:p>
+      <w:pPr>
+        <w:rPr>
+          <w:b/>
+          <w:bCs/>
+        </w:rPr>
+      </w:pPr>
+      <w:proofErr w:type="spellStart"/>
+      <w:r>
+        <w:rPr>
+          <w:b/>
+          <w:bCs/>
+        </w:rPr>
+        <w:t>ListElement</w:t>
+      </w:r>
+      <w:proofErr w:type="spellEnd"/>
+      <w:r>
+        <w:rPr>
+          <w:b/>
+          <w:bCs/>
+        </w:rPr>
+        <w:t>: Uma lista com marcadores ou numerada</w:t>
+      </w:r>
+      <w:r>
+        <w:rPr>
+          <w:b/>
+          <w:bCs/>
+        </w:rPr>
+        <w:t xml:space="preserve"> - </w:t>
+      </w:r>
+      <w:r>
+        <w:rPr>
+          <w:b/>
+          <w:bCs/>
+        </w:rPr>
+        <w:t>list-element.js</w:t>
+      </w:r>
+    </w:p>
+    <w:p>
+      <w:hyperlink r:id="rId10" w:history="1">
         <w:r>
           <w:rPr>
             <w:rStyle w:val="Hyperlink"/>
@@ -968,14 +1878,31 @@
           <w:u w:val="none"/>
         </w:rPr>
       </w:pPr>
+      <w:hyperlink r:id="rId11" w:history="1">
+        <w:r>
+          <w:rPr>
+            <w:rStyle w:val="Hyperlink"/>
+          </w:rPr>
+          <w:t>https://raw.githubusercontent.com/AlexBrazil/Multimidia_Web/refs/heads/main/css/elements/list-element.css</w:t>
+        </w:r>
+      </w:hyperlink>
     </w:p>
     <w:p>
       <w:pPr>
         <w:rPr>
-          <w:b/>
-          <w:bCs/>
+          <w:rStyle w:val="Hyperlink"/>
+          <w:u w:val="none"/>
         </w:rPr>
       </w:pPr>
+    </w:p>
+    <w:p>
+      <w:pPr>
+        <w:rPr>
+          <w:b/>
+          <w:bCs/>
+        </w:rPr>
+      </w:pPr>
+      <w:proofErr w:type="spellStart"/>
       <w:r>
         <w:rPr>
           <w:b/>
@@ -983,6 +1910,7 @@
         </w:rPr>
         <w:t>VideoElement</w:t>
       </w:r>
+      <w:proofErr w:type="spellEnd"/>
       <w:r>
         <w:rPr>
           <w:b/>
@@ -1002,14 +1930,39 @@
           <w:b/>
           <w:bCs/>
         </w:rPr>
-        <w:t xml:space="preserve"> youtube, mídia direta e </w:t>
-      </w:r>
-      <w:r>
-        <w:rPr>
-          <w:b/>
-          <w:bCs/>
-        </w:rPr>
-        <w:t>Fallback para links externos</w:t>
+        <w:t xml:space="preserve"> </w:t>
+      </w:r>
+      <w:proofErr w:type="spellStart"/>
+      <w:r>
+        <w:rPr>
+          <w:b/>
+          <w:bCs/>
+        </w:rPr>
+        <w:t>youtube</w:t>
+      </w:r>
+      <w:proofErr w:type="spellEnd"/>
+      <w:r>
+        <w:rPr>
+          <w:b/>
+          <w:bCs/>
+        </w:rPr>
+        <w:t xml:space="preserve">, mídia direta e </w:t>
+      </w:r>
+      <w:proofErr w:type="spellStart"/>
+      <w:r>
+        <w:rPr>
+          <w:b/>
+          <w:bCs/>
+        </w:rPr>
+        <w:t>Fallback</w:t>
+      </w:r>
+      <w:proofErr w:type="spellEnd"/>
+      <w:r>
+        <w:rPr>
+          <w:b/>
+          <w:bCs/>
+        </w:rPr>
+        <w:t xml:space="preserve"> para links externos</w:t>
       </w:r>
       <w:r>
         <w:rPr>
@@ -1027,7 +1980,7 @@
       </w:r>
     </w:p>
     <w:p>
-      <w:hyperlink r:id="rId10" w:history="1">
+      <w:hyperlink r:id="rId12" w:history="1">
         <w:r>
           <w:rPr>
             <w:rStyle w:val="Hyperlink"/>
@@ -1037,6 +1990,16 @@
       </w:hyperlink>
     </w:p>
     <w:p>
+      <w:hyperlink r:id="rId13" w:history="1">
+        <w:r>
+          <w:rPr>
+            <w:rStyle w:val="Hyperlink"/>
+          </w:rPr>
+          <w:t>https://raw.githubusercontent.com/AlexBrazil/Multimidia_Web/refs/heads/main/css/elements/video-element.css</w:t>
+        </w:r>
+      </w:hyperlink>
+    </w:p>
+    <w:p>
       <w:pPr>
         <w:rPr>
           <w:b/>
@@ -1051,12 +2014,21 @@
           <w:bCs/>
         </w:rPr>
       </w:pPr>
-      <w:r>
-        <w:rPr>
-          <w:b/>
-          <w:bCs/>
-        </w:rPr>
-        <w:t>SpacerElement: Usado para layout, para criar um espaço vazio</w:t>
+      <w:proofErr w:type="spellStart"/>
+      <w:r>
+        <w:rPr>
+          <w:b/>
+          <w:bCs/>
+        </w:rPr>
+        <w:t>SpacerElement</w:t>
+      </w:r>
+      <w:proofErr w:type="spellEnd"/>
+      <w:r>
+        <w:rPr>
+          <w:b/>
+          <w:bCs/>
+        </w:rPr>
+        <w:t>: Usado para layout, para criar um espaço vazio</w:t>
       </w:r>
       <w:r>
         <w:rPr>
@@ -1074,7 +2046,7 @@
       </w:r>
     </w:p>
     <w:p>
-      <w:hyperlink r:id="rId11" w:history="1">
+      <w:hyperlink r:id="rId14" w:history="1">
         <w:r>
           <w:rPr>
             <w:rStyle w:val="Hyperlink"/>
@@ -1084,6 +2056,16 @@
       </w:hyperlink>
     </w:p>
     <w:p>
+      <w:hyperlink r:id="rId15" w:history="1">
+        <w:r>
+          <w:rPr>
+            <w:rStyle w:val="Hyperlink"/>
+          </w:rPr>
+          <w:t>https://raw.githubusercontent.com/AlexBrazil/Multimidia_Web/refs/heads/main/css/elements/spacer-element.css</w:t>
+        </w:r>
+      </w:hyperlink>
+    </w:p>
+    <w:p>
       <w:pPr>
         <w:rPr>
           <w:b/>
@@ -1098,12 +2080,21 @@
           <w:bCs/>
         </w:rPr>
       </w:pPr>
-      <w:r>
-        <w:rPr>
-          <w:b/>
-          <w:bCs/>
-        </w:rPr>
-        <w:t>GridElement: Uma grade ou tabela</w:t>
+      <w:proofErr w:type="spellStart"/>
+      <w:r>
+        <w:rPr>
+          <w:b/>
+          <w:bCs/>
+        </w:rPr>
+        <w:t>GridElement</w:t>
+      </w:r>
+      <w:proofErr w:type="spellEnd"/>
+      <w:r>
+        <w:rPr>
+          <w:b/>
+          <w:bCs/>
+        </w:rPr>
+        <w:t>: Uma grade ou tabela</w:t>
       </w:r>
       <w:r>
         <w:rPr>
@@ -1121,13 +2112,7 @@
       </w:r>
     </w:p>
     <w:p>
-      <w:pPr>
-        <w:rPr>
-          <w:b/>
-          <w:bCs/>
-        </w:rPr>
-      </w:pPr>
-      <w:hyperlink r:id="rId12" w:history="1">
+      <w:hyperlink r:id="rId16" w:history="1">
         <w:r>
           <w:rPr>
             <w:rStyle w:val="Hyperlink"/>
@@ -1145,6 +2130,16 @@
           <w:bCs/>
         </w:rPr>
       </w:pPr>
+      <w:hyperlink r:id="rId17" w:history="1">
+        <w:r>
+          <w:rPr>
+            <w:rStyle w:val="Hyperlink"/>
+            <w:b/>
+            <w:bCs/>
+          </w:rPr>
+          <w:t>https://raw.githubusercontent.com/AlexBrazil/Multimidia_Web/refs/heads/main/css/elements/grid-element.css</w:t>
+        </w:r>
+      </w:hyperlink>
     </w:p>
     <w:p>
       <w:pPr>
@@ -1153,12 +2148,30 @@
           <w:bCs/>
         </w:rPr>
       </w:pPr>
-      <w:r>
-        <w:rPr>
-          <w:b/>
-          <w:bCs/>
-        </w:rPr>
-        <w:t>GroupElement: Um contêiner para agrupar outros elementos para fins de layout</w:t>
+    </w:p>
+    <w:p>
+      <w:pPr>
+        <w:rPr>
+          <w:b/>
+          <w:bCs/>
+        </w:rPr>
+      </w:pPr>
+      <w:proofErr w:type="spellStart"/>
+      <w:r>
+        <w:rPr>
+          <w:b/>
+          <w:bCs/>
+        </w:rPr>
+        <w:lastRenderedPageBreak/>
+        <w:t>GroupElement</w:t>
+      </w:r>
+      <w:proofErr w:type="spellEnd"/>
+      <w:r>
+        <w:rPr>
+          <w:b/>
+          <w:bCs/>
+        </w:rPr>
+        <w:t>: Um contêiner para agrupar outros elementos para fins de layout</w:t>
       </w:r>
       <w:r>
         <w:rPr>
@@ -1176,13 +2189,7 @@
       </w:r>
     </w:p>
     <w:p>
-      <w:pPr>
-        <w:rPr>
-          <w:b/>
-          <w:bCs/>
-        </w:rPr>
-      </w:pPr>
-      <w:hyperlink r:id="rId13" w:history="1">
+      <w:hyperlink r:id="rId18" w:history="1">
         <w:r>
           <w:rPr>
             <w:rStyle w:val="Hyperlink"/>
@@ -1200,12 +2207,63 @@
           <w:bCs/>
         </w:rPr>
       </w:pPr>
-      <w:r>
-        <w:rPr>
-          <w:b/>
-          <w:bCs/>
-        </w:rPr>
-        <w:t>InfoBoxElement: Um tipo especial de GroupElement que aparece como uma caixa de destaque estilizada</w:t>
+      <w:hyperlink r:id="rId19" w:history="1">
+        <w:r>
+          <w:rPr>
+            <w:rStyle w:val="Hyperlink"/>
+            <w:b/>
+            <w:bCs/>
+          </w:rPr>
+          <w:t>https://raw.githubusercontent.com/AlexBrazil/Multimidia_Web/refs/heads/main/css/elements/group-element.css</w:t>
+        </w:r>
+      </w:hyperlink>
+    </w:p>
+    <w:p>
+      <w:pPr>
+        <w:rPr>
+          <w:b/>
+          <w:bCs/>
+        </w:rPr>
+      </w:pPr>
+    </w:p>
+    <w:p>
+      <w:pPr>
+        <w:rPr>
+          <w:b/>
+          <w:bCs/>
+        </w:rPr>
+      </w:pPr>
+      <w:proofErr w:type="spellStart"/>
+      <w:r>
+        <w:rPr>
+          <w:b/>
+          <w:bCs/>
+        </w:rPr>
+        <w:t>InfoBoxElement</w:t>
+      </w:r>
+      <w:proofErr w:type="spellEnd"/>
+      <w:r>
+        <w:rPr>
+          <w:b/>
+          <w:bCs/>
+        </w:rPr>
+        <w:t>: Um tipo especial de </w:t>
+      </w:r>
+      <w:proofErr w:type="spellStart"/>
+      <w:r>
+        <w:rPr>
+          <w:b/>
+          <w:bCs/>
+        </w:rPr>
+        <w:t>GroupElement</w:t>
+      </w:r>
+      <w:proofErr w:type="spellEnd"/>
+      <w:r>
+        <w:rPr>
+          <w:b/>
+          <w:bCs/>
+        </w:rPr>
+        <w:t> que aparece como uma caixa de destaque estilizada</w:t>
       </w:r>
       <w:r>
         <w:rPr>
@@ -1216,7 +2274,7 @@
       </w:r>
     </w:p>
     <w:p>
-      <w:hyperlink r:id="rId14" w:history="1">
+      <w:hyperlink r:id="rId20" w:history="1">
         <w:r>
           <w:rPr>
             <w:rStyle w:val="Hyperlink"/>
@@ -1226,6 +2284,16 @@
       </w:hyperlink>
     </w:p>
     <w:p>
+      <w:hyperlink r:id="rId21" w:history="1">
+        <w:r>
+          <w:rPr>
+            <w:rStyle w:val="Hyperlink"/>
+          </w:rPr>
+          <w:t>https://raw.githubusercontent.com/AlexBrazil/Multimidia_Web/refs/heads/main/css/elements/infobox-element.css</w:t>
+        </w:r>
+      </w:hyperlink>
+    </w:p>
+    <w:p>
       <w:pPr>
         <w:rPr>
           <w:b/>
@@ -1235,20 +2303,25 @@
       </w:pPr>
     </w:p>
     <w:p>
-      <w:r>
-        <w:lastRenderedPageBreak/>
-        <w:t xml:space="preserve">ImageElement: Renderização de imagens com suporte a legenda e fallback Flash - image-element.js </w:t>
-      </w:r>
-    </w:p>
-    <w:p>
-      <w:pPr>
-        <w:rPr>
-          <w:b/>
-          <w:bCs/>
-          <w:u w:val="single"/>
-        </w:rPr>
-      </w:pPr>
-      <w:hyperlink r:id="rId15" w:history="1">
+      <w:proofErr w:type="spellStart"/>
+      <w:r>
+        <w:t>ImageElement</w:t>
+      </w:r>
+      <w:proofErr w:type="spellEnd"/>
+      <w:r>
+        <w:t xml:space="preserve">: Renderização de imagens com suporte a legenda e </w:t>
+      </w:r>
+      <w:proofErr w:type="spellStart"/>
+      <w:r>
+        <w:t>fallback</w:t>
+      </w:r>
+      <w:proofErr w:type="spellEnd"/>
+      <w:r>
+        <w:t xml:space="preserve"> Flash - image-element.js </w:t>
+      </w:r>
+    </w:p>
+    <w:p>
+      <w:hyperlink r:id="rId22" w:history="1">
         <w:r>
           <w:rPr>
             <w:rStyle w:val="Hyperlink"/>
@@ -1260,10 +2333,54 @@
       </w:hyperlink>
     </w:p>
     <w:p>
-      <w:r>
-        <w:t xml:space="preserve"> AppLauncherElement: Lançador de aplicativos/jogos externos (ZIP ou WebGL) - app-launcher.js </w:t>
-      </w:r>
-      <w:hyperlink r:id="rId16" w:history="1">
+      <w:pPr>
+        <w:rPr>
+          <w:b/>
+          <w:bCs/>
+          <w:u w:val="single"/>
+        </w:rPr>
+      </w:pPr>
+      <w:hyperlink r:id="rId23" w:history="1">
+        <w:r>
+          <w:rPr>
+            <w:rStyle w:val="Hyperlink"/>
+            <w:b/>
+            <w:bCs/>
+          </w:rPr>
+          <w:t>https://raw.githubusercontent.com/AlexBrazil/Multimidia_Web/refs/heads/main/css/elements/image-element.css</w:t>
+        </w:r>
+      </w:hyperlink>
+    </w:p>
+    <w:p>
+      <w:pPr>
+        <w:rPr>
+          <w:b/>
+          <w:bCs/>
+          <w:u w:val="single"/>
+        </w:rPr>
+      </w:pPr>
+    </w:p>
+    <w:p>
+      <w:r>
+        <w:t xml:space="preserve"> </w:t>
+      </w:r>
+      <w:proofErr w:type="spellStart"/>
+      <w:r>
+        <w:t>AppLauncherElement</w:t>
+      </w:r>
+      <w:proofErr w:type="spellEnd"/>
+      <w:r>
+        <w:t xml:space="preserve">: Lançador de aplicativos/jogos externos (ZIP ou </w:t>
+      </w:r>
+      <w:proofErr w:type="spellStart"/>
+      <w:r>
+        <w:t>WebGL</w:t>
+      </w:r>
+      <w:proofErr w:type="spellEnd"/>
+      <w:r>
+        <w:t xml:space="preserve">) - app-launcher.js </w:t>
+      </w:r>
+      <w:hyperlink r:id="rId24" w:history="1">
         <w:r>
           <w:rPr>
             <w:rStyle w:val="Hyperlink"/>
@@ -1275,6 +2392,17 @@
       </w:hyperlink>
     </w:p>
     <w:p>
+      <w:hyperlink r:id="rId25" w:history="1">
+        <w:r>
+          <w:rPr>
+            <w:rStyle w:val="Hyperlink"/>
+          </w:rPr>
+          <w:t>https://raw.githubusercontent.com/AlexBrazil/Multimidia_Web/refs/heads/main/css/elements/app-launcher-element.css</w:t>
+        </w:r>
+      </w:hyperlink>
+    </w:p>
+    <w:p/>
+    <w:p>
       <w:r>
         <w:t>card-image-element.js</w:t>
       </w:r>
@@ -1283,7 +2411,7 @@
       </w:r>
     </w:p>
     <w:p>
-      <w:hyperlink r:id="rId17" w:history="1">
+      <w:hyperlink r:id="rId26" w:history="1">
         <w:r>
           <w:rPr>
             <w:rStyle w:val="Hyperlink"/>
@@ -1293,12 +2421,22 @@
       </w:hyperlink>
     </w:p>
     <w:p>
+      <w:hyperlink r:id="rId27" w:history="1">
+        <w:r>
+          <w:rPr>
+            <w:rStyle w:val="Hyperlink"/>
+          </w:rPr>
+          <w:t>https://raw.githubusercontent.com/AlexBrazil/Multimidia_Web/refs/heads/main/css/elements/card-image-element.css</w:t>
+        </w:r>
+      </w:hyperlink>
+    </w:p>
+    <w:p>
       <w:r>
         <w:t>base.js: Utilitários compartilhados entre todos os elementos do slide. Centraliza funcionalidades comuns para evitar duplicação</w:t>
       </w:r>
     </w:p>
     <w:p>
-      <w:hyperlink r:id="rId18" w:history="1">
+      <w:hyperlink r:id="rId28" w:history="1">
         <w:r>
           <w:rPr>
             <w:rStyle w:val="Hyperlink"/>
@@ -1309,6 +2447,80 @@
         </w:r>
       </w:hyperlink>
     </w:p>
+    <w:p/>
+    <w:p>
+      <w:r>
+        <w:t xml:space="preserve">Além disso temos o </w:t>
+      </w:r>
+      <w:proofErr w:type="spellStart"/>
+      <w:r>
+        <w:t>css</w:t>
+      </w:r>
+      <w:proofErr w:type="spellEnd"/>
+      <w:r>
+        <w:t xml:space="preserve"> essencial:</w:t>
+      </w:r>
+    </w:p>
+    <w:p>
+      <w:r>
+        <w:t>base.css</w:t>
+      </w:r>
+    </w:p>
+    <w:p>
+      <w:hyperlink r:id="rId29" w:history="1">
+        <w:r>
+          <w:rPr>
+            <w:rStyle w:val="Hyperlink"/>
+          </w:rPr>
+          <w:t>https://raw.githubusercontent.com/AlexBrazil/Multimidia_Web/refs/heads/main/css/core/base.css</w:t>
+        </w:r>
+      </w:hyperlink>
+    </w:p>
+    <w:p>
+      <w:r>
+        <w:t>responsive.css</w:t>
+      </w:r>
+    </w:p>
+    <w:p>
+      <w:hyperlink r:id="rId30" w:history="1">
+        <w:r>
+          <w:rPr>
+            <w:rStyle w:val="Hyperlink"/>
+          </w:rPr>
+          <w:t>https://raw.githubusercontent.com/AlexBrazil/Multimidia_Web/refs/heads/main/css/core/responsive.css</w:t>
+        </w:r>
+      </w:hyperlink>
+    </w:p>
+    <w:p/>
+    <w:p>
+      <w:r>
+        <w:t xml:space="preserve">Temos também o </w:t>
+      </w:r>
+      <w:proofErr w:type="spellStart"/>
+      <w:r>
+        <w:t>css</w:t>
+      </w:r>
+      <w:proofErr w:type="spellEnd"/>
+      <w:r>
+        <w:t xml:space="preserve"> compartilhado:</w:t>
+      </w:r>
+    </w:p>
+    <w:p>
+      <w:r>
+        <w:t>scroll-indicator.css</w:t>
+      </w:r>
+    </w:p>
+    <w:p>
+      <w:hyperlink r:id="rId31" w:history="1">
+        <w:r>
+          <w:rPr>
+            <w:rStyle w:val="Hyperlink"/>
+          </w:rPr>
+          <w:t>https://raw.githubusercontent.com/AlexBrazil/Multimidia_Web/refs/heads/main/css/shared/scroll-indicator.css</w:t>
+        </w:r>
+      </w:hyperlink>
+    </w:p>
+    <w:p/>
     <w:p>
       <w:pPr>
         <w:rPr>
@@ -1318,7 +2530,15 @@
         </w:rPr>
       </w:pPr>
       <w:r>
-        <w:t>Acesse casa link raw para entender de forma completa como os slides são renderizados e como ocorre a navegação pelos mesmos.</w:t>
+        <w:t xml:space="preserve">Acesse casa link </w:t>
+      </w:r>
+      <w:proofErr w:type="spellStart"/>
+      <w:r>
+        <w:t>raw</w:t>
+      </w:r>
+      <w:proofErr w:type="spellEnd"/>
+      <w:r>
+        <w:t xml:space="preserve"> para entender de forma completa como os slides são renderizados e como ocorre a navegação pelos mesmos.</w:t>
       </w:r>
     </w:p>
     <w:p>
@@ -2333,6 +3553,18 @@
       <w:szCs w:val="20"/>
     </w:rPr>
   </w:style>
+  <w:style w:type="character" w:styleId="HiperlinkVisitado">
+    <w:name w:val="FollowedHyperlink"/>
+    <w:basedOn w:val="Fontepargpadro"/>
+    <w:uiPriority w:val="99"/>
+    <w:semiHidden/>
+    <w:unhideWhenUsed/>
+    <w:rsid w:val="00932DD7"/>
+    <w:rPr>
+      <w:color w:val="954F72" w:themeColor="followedHyperlink"/>
+      <w:u w:val="single"/>
+    </w:rPr>
+  </w:style>
 </w:styles>
 </file>
 

</xml_diff>